<commit_message>
Some modifications to High Vol. Architecture doc.
</commit_message>
<xml_diff>
--- a/High_Volume_Low_Latency_Transaction Architectures.docx
+++ b/High_Volume_Low_Latency_Transaction Architectures.docx
@@ -5,6 +5,8 @@
     <w:p>
       <w:pPr>
         <w:rPr>
+          <w:b/>
+          <w:bCs/>
           <w:color w:val="8EAADB" w:themeColor="accent5" w:themeTint="99"/>
           <w:lang w:val="en-US"/>
         </w:rPr>
@@ -24,6 +26,1055 @@
           <w:lang w:val="en-US"/>
         </w:rPr>
         <w:t xml:space="preserve">Architectures </w:t>
+      </w:r>
+    </w:p>
+    <w:p>
+      <w:pPr>
+        <w:rPr>
+          <w:b/>
+          <w:bCs/>
+          <w:color w:val="8EAADB" w:themeColor="accent5" w:themeTint="99"/>
+          <w:lang w:val="en-US"/>
+        </w:rPr>
+      </w:pPr>
+      <w:r>
+        <w:rPr>
+          <w:b/>
+          <w:bCs/>
+          <w:color w:val="8EAADB" w:themeColor="accent5" w:themeTint="99"/>
+          <w:lang w:val="en-US"/>
+        </w:rPr>
+        <w:t>What are the highest throughput rates in http traffic of financial systems</w:t>
+      </w:r>
+    </w:p>
+    <w:p>
+      <w:pPr>
+        <w:rPr>
+          <w:b/>
+          <w:bCs/>
+        </w:rPr>
+      </w:pPr>
+      <w:r>
+        <w:rPr>
+          <w:rFonts w:ascii="Arial" w:eastAsia="Times New Roman" w:hAnsi="Arial" w:cs="Arial"/>
+          <w:color w:val="1B1C1D"/>
+          <w:kern w:val="0"/>
+          <w:sz w:val="24"/>
+          <w:szCs w:val="24"/>
+          <w:bdr w:val="none" w:sz="0" w:space="0" w:color="auto" w:frame="1"/>
+          <w:lang w:eastAsia="en-IN"/>
+          <w14:ligatures w14:val="none"/>
+        </w:rPr>
+        <w:t xml:space="preserve"> </w:t>
+      </w:r>
+      <w:r>
+        <w:rPr>
+          <w:b/>
+          <w:bCs/>
+        </w:rPr>
+        <w:t>The highest throughput rates in HTTP traffic for financial systems are found in global payment networks and super-app digital wallets, measured in Transactions Per Second (TPS) rather than standard HTTP requests per second, due to the critical transactional nature of the data.</w:t>
+      </w:r>
+      <w:r>
+        <w:rPr>
+          <w:b/>
+          <w:bCs/>
+          <w:vertAlign w:val="superscript"/>
+        </w:rPr>
+        <w:t>1</w:t>
+      </w:r>
+    </w:p>
+    <w:p>
+      <w:pPr>
+        <w:rPr>
+          <w:b/>
+          <w:bCs/>
+        </w:rPr>
+      </w:pPr>
+      <w:r>
+        <w:rPr>
+          <w:b/>
+          <w:bCs/>
+        </w:rPr>
+        <w:t>While most general financial applications and neobanks operate in the hundreds or low thousands of TPS, the peak throughputs for global, mass-scale systems are substantially higher.</w:t>
+      </w:r>
+      <w:r>
+        <w:rPr>
+          <w:b/>
+          <w:bCs/>
+          <w:vertAlign w:val="superscript"/>
+        </w:rPr>
+        <w:t>2</w:t>
+      </w:r>
+    </w:p>
+    <w:p>
+      <w:pPr>
+        <w:rPr>
+          <w:b/>
+          <w:bCs/>
+        </w:rPr>
+      </w:pPr>
+      <w:r>
+        <w:rPr>
+          <w:b/>
+          <w:bCs/>
+        </w:rPr>
+        <w:pict w14:anchorId="24303C7D">
+          <v:rect id="_x0000_i1053" style="width:0;height:1.5pt" o:hralign="center" o:hrstd="t" o:hrnoshade="t" o:hr="t" fillcolor="gray" stroked="f"/>
+        </w:pict>
+      </w:r>
+    </w:p>
+    <w:p>
+      <w:pPr>
+        <w:rPr>
+          <w:b/>
+          <w:bCs/>
+        </w:rPr>
+      </w:pPr>
+      <w:r>
+        <w:rPr>
+          <w:rFonts w:ascii="Segoe UI Emoji" w:hAnsi="Segoe UI Emoji" w:cs="Segoe UI Emoji"/>
+          <w:b/>
+          <w:bCs/>
+        </w:rPr>
+        <w:t>📈</w:t>
+      </w:r>
+      <w:r>
+        <w:rPr>
+          <w:b/>
+          <w:bCs/>
+        </w:rPr>
+        <w:t xml:space="preserve"> Peak Financial Throughput Rates (TPS)</w:t>
+      </w:r>
+    </w:p>
+    <w:p>
+      <w:pPr>
+        <w:rPr>
+          <w:b/>
+          <w:bCs/>
+        </w:rPr>
+      </w:pPr>
+      <w:r>
+        <w:rPr>
+          <w:b/>
+          <w:bCs/>
+        </w:rPr>
+        <w:t>The highest observed throughput rates occur during short, high-traffic events, often exceeding 100,000 TPS:</w:t>
+      </w:r>
+    </w:p>
+    <w:p>
+      <w:pPr>
+        <w:numPr>
+          <w:ilvl w:val="0"/>
+          <w:numId w:val="10"/>
+        </w:numPr>
+        <w:rPr>
+          <w:b/>
+          <w:bCs/>
+        </w:rPr>
+      </w:pPr>
+      <w:r>
+        <w:rPr>
+          <w:b/>
+          <w:bCs/>
+        </w:rPr>
+        <w:t>Alipay (Ant Financial): Peaked at an astonishing 544,000 TPS during China's Singles' Day shopping event in 2019.</w:t>
+      </w:r>
+      <w:r>
+        <w:rPr>
+          <w:b/>
+          <w:bCs/>
+          <w:vertAlign w:val="superscript"/>
+        </w:rPr>
+        <w:t>3</w:t>
+      </w:r>
+    </w:p>
+    <w:p>
+      <w:pPr>
+        <w:numPr>
+          <w:ilvl w:val="0"/>
+          <w:numId w:val="10"/>
+        </w:numPr>
+        <w:rPr>
+          <w:b/>
+          <w:bCs/>
+        </w:rPr>
+      </w:pPr>
+      <w:r>
+        <w:rPr>
+          <w:b/>
+          <w:bCs/>
+        </w:rPr>
+        <w:t>WeChat Pay: Saw bursts of around 409,000 TPS during seasonal high-volume events (e.g., Lunar New Year digital "red envelope" campaigns).</w:t>
+      </w:r>
+      <w:r>
+        <w:rPr>
+          <w:b/>
+          <w:bCs/>
+          <w:vertAlign w:val="superscript"/>
+        </w:rPr>
+        <w:t>4</w:t>
+      </w:r>
+    </w:p>
+    <w:p>
+      <w:pPr>
+        <w:rPr>
+          <w:b/>
+          <w:bCs/>
+        </w:rPr>
+      </w:pPr>
+      <w:r>
+        <w:rPr>
+          <w:b/>
+          <w:bCs/>
+        </w:rPr>
+        <w:t>Sustained &amp; Peak Capacity</w:t>
+      </w:r>
+    </w:p>
+    <w:p>
+      <w:pPr>
+        <w:rPr>
+          <w:b/>
+          <w:bCs/>
+        </w:rPr>
+      </w:pPr>
+      <w:r>
+        <w:rPr>
+          <w:b/>
+          <w:bCs/>
+        </w:rPr>
+        <w:t>For major card networks and national payment infrastructures, the sustained and peak capacity figures are:</w:t>
+      </w:r>
+    </w:p>
+    <w:tbl>
+      <w:tblPr>
+        <w:tblW w:w="0" w:type="auto"/>
+        <w:tblCellSpacing w:w="15" w:type="dxa"/>
+        <w:tblCellMar>
+          <w:left w:w="0" w:type="dxa"/>
+          <w:right w:w="0" w:type="dxa"/>
+        </w:tblCellMar>
+        <w:tblLook w:val="04A0" w:firstRow="1" w:lastRow="0" w:firstColumn="1" w:lastColumn="0" w:noHBand="0" w:noVBand="1"/>
+      </w:tblPr>
+      <w:tblGrid>
+        <w:gridCol w:w="1575"/>
+        <w:gridCol w:w="2685"/>
+        <w:gridCol w:w="4361"/>
+      </w:tblGrid>
+      <w:tr>
+        <w:trPr>
+          <w:tblHeader/>
+          <w:tblCellSpacing w:w="15" w:type="dxa"/>
+        </w:trPr>
+        <w:tc>
+          <w:tcPr>
+            <w:tcW w:w="0" w:type="auto"/>
+            <w:tcBorders>
+              <w:top w:val="single" w:sz="6" w:space="0" w:color="auto"/>
+              <w:left w:val="single" w:sz="6" w:space="0" w:color="auto"/>
+              <w:bottom w:val="single" w:sz="6" w:space="0" w:color="auto"/>
+              <w:right w:val="single" w:sz="6" w:space="0" w:color="auto"/>
+            </w:tcBorders>
+            <w:tcMar>
+              <w:top w:w="120" w:type="dxa"/>
+              <w:left w:w="180" w:type="dxa"/>
+              <w:bottom w:w="120" w:type="dxa"/>
+              <w:right w:w="180" w:type="dxa"/>
+            </w:tcMar>
+            <w:vAlign w:val="center"/>
+            <w:hideMark/>
+          </w:tcPr>
+          <w:p>
+            <w:pPr>
+              <w:rPr>
+                <w:b/>
+                <w:bCs/>
+              </w:rPr>
+            </w:pPr>
+            <w:r>
+              <w:rPr>
+                <w:b/>
+                <w:bCs/>
+              </w:rPr>
+              <w:t>Platform</w:t>
+            </w:r>
+          </w:p>
+        </w:tc>
+        <w:tc>
+          <w:tcPr>
+            <w:tcW w:w="0" w:type="auto"/>
+            <w:tcBorders>
+              <w:top w:val="single" w:sz="6" w:space="0" w:color="auto"/>
+              <w:left w:val="single" w:sz="6" w:space="0" w:color="auto"/>
+              <w:bottom w:val="single" w:sz="6" w:space="0" w:color="auto"/>
+              <w:right w:val="single" w:sz="6" w:space="0" w:color="auto"/>
+            </w:tcBorders>
+            <w:tcMar>
+              <w:top w:w="120" w:type="dxa"/>
+              <w:left w:w="180" w:type="dxa"/>
+              <w:bottom w:w="120" w:type="dxa"/>
+              <w:right w:w="180" w:type="dxa"/>
+            </w:tcMar>
+            <w:vAlign w:val="center"/>
+            <w:hideMark/>
+          </w:tcPr>
+          <w:p>
+            <w:pPr>
+              <w:rPr>
+                <w:b/>
+                <w:bCs/>
+              </w:rPr>
+            </w:pPr>
+            <w:r>
+              <w:rPr>
+                <w:b/>
+                <w:bCs/>
+              </w:rPr>
+              <w:t>Average Sustained TPS</w:t>
+            </w:r>
+          </w:p>
+        </w:tc>
+        <w:tc>
+          <w:tcPr>
+            <w:tcW w:w="0" w:type="auto"/>
+            <w:tcBorders>
+              <w:top w:val="single" w:sz="6" w:space="0" w:color="auto"/>
+              <w:left w:val="single" w:sz="6" w:space="0" w:color="auto"/>
+              <w:bottom w:val="single" w:sz="6" w:space="0" w:color="auto"/>
+              <w:right w:val="single" w:sz="6" w:space="0" w:color="auto"/>
+            </w:tcBorders>
+            <w:tcMar>
+              <w:top w:w="120" w:type="dxa"/>
+              <w:left w:w="180" w:type="dxa"/>
+              <w:bottom w:w="120" w:type="dxa"/>
+              <w:right w:w="180" w:type="dxa"/>
+            </w:tcMar>
+            <w:vAlign w:val="center"/>
+            <w:hideMark/>
+          </w:tcPr>
+          <w:p>
+            <w:pPr>
+              <w:rPr>
+                <w:b/>
+                <w:bCs/>
+              </w:rPr>
+            </w:pPr>
+            <w:r>
+              <w:rPr>
+                <w:b/>
+                <w:bCs/>
+              </w:rPr>
+              <w:t>Peak/Event Capacity (TPS)</w:t>
+            </w:r>
+          </w:p>
+        </w:tc>
+      </w:tr>
+      <w:tr>
+        <w:trPr>
+          <w:tblCellSpacing w:w="15" w:type="dxa"/>
+        </w:trPr>
+        <w:tc>
+          <w:tcPr>
+            <w:tcW w:w="0" w:type="auto"/>
+            <w:tcBorders>
+              <w:top w:val="single" w:sz="6" w:space="0" w:color="auto"/>
+              <w:left w:val="single" w:sz="6" w:space="0" w:color="auto"/>
+              <w:bottom w:val="single" w:sz="6" w:space="0" w:color="auto"/>
+              <w:right w:val="single" w:sz="6" w:space="0" w:color="auto"/>
+            </w:tcBorders>
+            <w:tcMar>
+              <w:top w:w="120" w:type="dxa"/>
+              <w:left w:w="180" w:type="dxa"/>
+              <w:bottom w:w="120" w:type="dxa"/>
+              <w:right w:w="180" w:type="dxa"/>
+            </w:tcMar>
+            <w:vAlign w:val="center"/>
+            <w:hideMark/>
+          </w:tcPr>
+          <w:p>
+            <w:pPr>
+              <w:rPr>
+                <w:b/>
+                <w:bCs/>
+              </w:rPr>
+            </w:pPr>
+            <w:r>
+              <w:rPr>
+                <w:b/>
+                <w:bCs/>
+              </w:rPr>
+              <w:t>Visa</w:t>
+            </w:r>
+          </w:p>
+        </w:tc>
+        <w:tc>
+          <w:tcPr>
+            <w:tcW w:w="0" w:type="auto"/>
+            <w:tcBorders>
+              <w:top w:val="single" w:sz="6" w:space="0" w:color="auto"/>
+              <w:left w:val="single" w:sz="6" w:space="0" w:color="auto"/>
+              <w:bottom w:val="single" w:sz="6" w:space="0" w:color="auto"/>
+              <w:right w:val="single" w:sz="6" w:space="0" w:color="auto"/>
+            </w:tcBorders>
+            <w:tcMar>
+              <w:top w:w="120" w:type="dxa"/>
+              <w:left w:w="180" w:type="dxa"/>
+              <w:bottom w:w="120" w:type="dxa"/>
+              <w:right w:w="180" w:type="dxa"/>
+            </w:tcMar>
+            <w:vAlign w:val="center"/>
+            <w:hideMark/>
+          </w:tcPr>
+          <w:p>
+            <w:pPr>
+              <w:rPr>
+                <w:b/>
+                <w:bCs/>
+              </w:rPr>
+            </w:pPr>
+            <w:r>
+              <w:rPr>
+                <w:b/>
+                <w:bCs/>
+              </w:rPr>
+              <w:t>$\sim 8,500$ TPS</w:t>
+            </w:r>
+          </w:p>
+        </w:tc>
+        <w:tc>
+          <w:tcPr>
+            <w:tcW w:w="0" w:type="auto"/>
+            <w:tcBorders>
+              <w:top w:val="single" w:sz="6" w:space="0" w:color="auto"/>
+              <w:left w:val="single" w:sz="6" w:space="0" w:color="auto"/>
+              <w:bottom w:val="single" w:sz="6" w:space="0" w:color="auto"/>
+              <w:right w:val="single" w:sz="6" w:space="0" w:color="auto"/>
+            </w:tcBorders>
+            <w:tcMar>
+              <w:top w:w="120" w:type="dxa"/>
+              <w:left w:w="180" w:type="dxa"/>
+              <w:bottom w:w="120" w:type="dxa"/>
+              <w:right w:w="180" w:type="dxa"/>
+            </w:tcMar>
+            <w:vAlign w:val="center"/>
+            <w:hideMark/>
+          </w:tcPr>
+          <w:p>
+            <w:pPr>
+              <w:rPr>
+                <w:b/>
+                <w:bCs/>
+              </w:rPr>
+            </w:pPr>
+            <w:r>
+              <w:rPr>
+                <w:b/>
+                <w:bCs/>
+              </w:rPr>
+              <w:t>Up to $\</w:t>
+            </w:r>
+            <w:proofErr w:type="spellStart"/>
+            <w:proofErr w:type="gramStart"/>
+            <w:r>
+              <w:rPr>
+                <w:b/>
+                <w:bCs/>
+              </w:rPr>
+              <w:t>mathbf</w:t>
+            </w:r>
+            <w:proofErr w:type="spellEnd"/>
+            <w:r>
+              <w:rPr>
+                <w:b/>
+                <w:bCs/>
+              </w:rPr>
+              <w:t>{</w:t>
+            </w:r>
+            <w:proofErr w:type="gramEnd"/>
+            <w:r>
+              <w:rPr>
+                <w:b/>
+                <w:bCs/>
+              </w:rPr>
+              <w:t>65,000</w:t>
+            </w:r>
+            <w:proofErr w:type="gramStart"/>
+            <w:r>
+              <w:rPr>
+                <w:b/>
+                <w:bCs/>
+              </w:rPr>
+              <w:t>+}$</w:t>
+            </w:r>
+            <w:proofErr w:type="gramEnd"/>
+            <w:r>
+              <w:rPr>
+                <w:b/>
+                <w:bCs/>
+              </w:rPr>
+              <w:t xml:space="preserve"> TPS</w:t>
+            </w:r>
+          </w:p>
+        </w:tc>
+      </w:tr>
+      <w:tr>
+        <w:trPr>
+          <w:tblCellSpacing w:w="15" w:type="dxa"/>
+        </w:trPr>
+        <w:tc>
+          <w:tcPr>
+            <w:tcW w:w="0" w:type="auto"/>
+            <w:tcBorders>
+              <w:top w:val="single" w:sz="6" w:space="0" w:color="auto"/>
+              <w:left w:val="single" w:sz="6" w:space="0" w:color="auto"/>
+              <w:bottom w:val="single" w:sz="6" w:space="0" w:color="auto"/>
+              <w:right w:val="single" w:sz="6" w:space="0" w:color="auto"/>
+            </w:tcBorders>
+            <w:tcMar>
+              <w:top w:w="120" w:type="dxa"/>
+              <w:left w:w="180" w:type="dxa"/>
+              <w:bottom w:w="120" w:type="dxa"/>
+              <w:right w:w="180" w:type="dxa"/>
+            </w:tcMar>
+            <w:vAlign w:val="center"/>
+            <w:hideMark/>
+          </w:tcPr>
+          <w:p>
+            <w:pPr>
+              <w:rPr>
+                <w:b/>
+                <w:bCs/>
+              </w:rPr>
+            </w:pPr>
+            <w:r>
+              <w:rPr>
+                <w:b/>
+                <w:bCs/>
+              </w:rPr>
+              <w:t>Mastercard</w:t>
+            </w:r>
+          </w:p>
+        </w:tc>
+        <w:tc>
+          <w:tcPr>
+            <w:tcW w:w="0" w:type="auto"/>
+            <w:tcBorders>
+              <w:top w:val="single" w:sz="6" w:space="0" w:color="auto"/>
+              <w:left w:val="single" w:sz="6" w:space="0" w:color="auto"/>
+              <w:bottom w:val="single" w:sz="6" w:space="0" w:color="auto"/>
+              <w:right w:val="single" w:sz="6" w:space="0" w:color="auto"/>
+            </w:tcBorders>
+            <w:tcMar>
+              <w:top w:w="120" w:type="dxa"/>
+              <w:left w:w="180" w:type="dxa"/>
+              <w:bottom w:w="120" w:type="dxa"/>
+              <w:right w:w="180" w:type="dxa"/>
+            </w:tcMar>
+            <w:vAlign w:val="center"/>
+            <w:hideMark/>
+          </w:tcPr>
+          <w:p>
+            <w:pPr>
+              <w:rPr>
+                <w:b/>
+                <w:bCs/>
+              </w:rPr>
+            </w:pPr>
+            <w:r>
+              <w:rPr>
+                <w:b/>
+                <w:bCs/>
+              </w:rPr>
+              <w:t>$\sim 4,600$ TPS</w:t>
+            </w:r>
+          </w:p>
+        </w:tc>
+        <w:tc>
+          <w:tcPr>
+            <w:tcW w:w="0" w:type="auto"/>
+            <w:tcBorders>
+              <w:top w:val="single" w:sz="6" w:space="0" w:color="auto"/>
+              <w:left w:val="single" w:sz="6" w:space="0" w:color="auto"/>
+              <w:bottom w:val="single" w:sz="6" w:space="0" w:color="auto"/>
+              <w:right w:val="single" w:sz="6" w:space="0" w:color="auto"/>
+            </w:tcBorders>
+            <w:tcMar>
+              <w:top w:w="120" w:type="dxa"/>
+              <w:left w:w="180" w:type="dxa"/>
+              <w:bottom w:w="120" w:type="dxa"/>
+              <w:right w:w="180" w:type="dxa"/>
+            </w:tcMar>
+            <w:vAlign w:val="center"/>
+            <w:hideMark/>
+          </w:tcPr>
+          <w:p>
+            <w:pPr>
+              <w:rPr>
+                <w:b/>
+                <w:bCs/>
+              </w:rPr>
+            </w:pPr>
+            <w:r>
+              <w:rPr>
+                <w:b/>
+                <w:bCs/>
+              </w:rPr>
+              <w:t>Up to $\</w:t>
+            </w:r>
+            <w:proofErr w:type="spellStart"/>
+            <w:proofErr w:type="gramStart"/>
+            <w:r>
+              <w:rPr>
+                <w:b/>
+                <w:bCs/>
+              </w:rPr>
+              <w:t>mathbf</w:t>
+            </w:r>
+            <w:proofErr w:type="spellEnd"/>
+            <w:r>
+              <w:rPr>
+                <w:b/>
+                <w:bCs/>
+              </w:rPr>
+              <w:t>{20,000}$</w:t>
+            </w:r>
+            <w:proofErr w:type="gramEnd"/>
+            <w:r>
+              <w:rPr>
+                <w:b/>
+                <w:bCs/>
+              </w:rPr>
+              <w:t xml:space="preserve"> TPS</w:t>
+            </w:r>
+          </w:p>
+        </w:tc>
+      </w:tr>
+      <w:tr>
+        <w:trPr>
+          <w:tblCellSpacing w:w="15" w:type="dxa"/>
+        </w:trPr>
+        <w:tc>
+          <w:tcPr>
+            <w:tcW w:w="0" w:type="auto"/>
+            <w:tcBorders>
+              <w:top w:val="single" w:sz="6" w:space="0" w:color="auto"/>
+              <w:left w:val="single" w:sz="6" w:space="0" w:color="auto"/>
+              <w:bottom w:val="single" w:sz="6" w:space="0" w:color="auto"/>
+              <w:right w:val="single" w:sz="6" w:space="0" w:color="auto"/>
+            </w:tcBorders>
+            <w:tcMar>
+              <w:top w:w="120" w:type="dxa"/>
+              <w:left w:w="180" w:type="dxa"/>
+              <w:bottom w:w="120" w:type="dxa"/>
+              <w:right w:w="180" w:type="dxa"/>
+            </w:tcMar>
+            <w:vAlign w:val="center"/>
+            <w:hideMark/>
+          </w:tcPr>
+          <w:p>
+            <w:pPr>
+              <w:rPr>
+                <w:b/>
+                <w:bCs/>
+              </w:rPr>
+            </w:pPr>
+            <w:r>
+              <w:rPr>
+                <w:b/>
+                <w:bCs/>
+              </w:rPr>
+              <w:t>India's UPI</w:t>
+            </w:r>
+          </w:p>
+        </w:tc>
+        <w:tc>
+          <w:tcPr>
+            <w:tcW w:w="0" w:type="auto"/>
+            <w:tcBorders>
+              <w:top w:val="single" w:sz="6" w:space="0" w:color="auto"/>
+              <w:left w:val="single" w:sz="6" w:space="0" w:color="auto"/>
+              <w:bottom w:val="single" w:sz="6" w:space="0" w:color="auto"/>
+              <w:right w:val="single" w:sz="6" w:space="0" w:color="auto"/>
+            </w:tcBorders>
+            <w:tcMar>
+              <w:top w:w="120" w:type="dxa"/>
+              <w:left w:w="180" w:type="dxa"/>
+              <w:bottom w:w="120" w:type="dxa"/>
+              <w:right w:w="180" w:type="dxa"/>
+            </w:tcMar>
+            <w:vAlign w:val="center"/>
+            <w:hideMark/>
+          </w:tcPr>
+          <w:p>
+            <w:pPr>
+              <w:rPr>
+                <w:b/>
+                <w:bCs/>
+              </w:rPr>
+            </w:pPr>
+            <w:r>
+              <w:rPr>
+                <w:b/>
+                <w:bCs/>
+              </w:rPr>
+              <w:t>$\sim 7,500$ TPS</w:t>
+            </w:r>
+          </w:p>
+        </w:tc>
+        <w:tc>
+          <w:tcPr>
+            <w:tcW w:w="0" w:type="auto"/>
+            <w:tcBorders>
+              <w:top w:val="single" w:sz="6" w:space="0" w:color="auto"/>
+              <w:left w:val="single" w:sz="6" w:space="0" w:color="auto"/>
+              <w:bottom w:val="single" w:sz="6" w:space="0" w:color="auto"/>
+              <w:right w:val="single" w:sz="6" w:space="0" w:color="auto"/>
+            </w:tcBorders>
+            <w:tcMar>
+              <w:top w:w="120" w:type="dxa"/>
+              <w:left w:w="180" w:type="dxa"/>
+              <w:bottom w:w="120" w:type="dxa"/>
+              <w:right w:w="180" w:type="dxa"/>
+            </w:tcMar>
+            <w:vAlign w:val="center"/>
+            <w:hideMark/>
+          </w:tcPr>
+          <w:p>
+            <w:pPr>
+              <w:rPr>
+                <w:b/>
+                <w:bCs/>
+              </w:rPr>
+            </w:pPr>
+            <w:r>
+              <w:rPr>
+                <w:b/>
+                <w:bCs/>
+              </w:rPr>
+              <w:t>Architected for $\</w:t>
+            </w:r>
+            <w:proofErr w:type="spellStart"/>
+            <w:proofErr w:type="gramStart"/>
+            <w:r>
+              <w:rPr>
+                <w:b/>
+                <w:bCs/>
+              </w:rPr>
+              <w:t>mathbf</w:t>
+            </w:r>
+            <w:proofErr w:type="spellEnd"/>
+            <w:r>
+              <w:rPr>
+                <w:b/>
+                <w:bCs/>
+              </w:rPr>
+              <w:t>{</w:t>
+            </w:r>
+            <w:proofErr w:type="gramEnd"/>
+            <w:r>
+              <w:rPr>
+                <w:b/>
+                <w:bCs/>
+              </w:rPr>
+              <w:t>10,000</w:t>
+            </w:r>
+            <w:proofErr w:type="gramStart"/>
+            <w:r>
+              <w:rPr>
+                <w:b/>
+                <w:bCs/>
+              </w:rPr>
+              <w:t>+}$</w:t>
+            </w:r>
+            <w:proofErr w:type="gramEnd"/>
+            <w:r>
+              <w:rPr>
+                <w:b/>
+                <w:bCs/>
+              </w:rPr>
+              <w:t xml:space="preserve"> TPS</w:t>
+            </w:r>
+          </w:p>
+        </w:tc>
+      </w:tr>
+    </w:tbl>
+    <w:p>
+      <w:pPr>
+        <w:rPr>
+          <w:b/>
+          <w:bCs/>
+        </w:rPr>
+      </w:pPr>
+      <w:r>
+        <w:rPr>
+          <w:b/>
+          <w:bCs/>
+        </w:rPr>
+        <w:pict w14:anchorId="698D5E06">
+          <v:rect id="_x0000_i1054" style="width:0;height:1.5pt" o:hralign="center" o:hrstd="t" o:hrnoshade="t" o:hr="t" fillcolor="gray" stroked="f"/>
+        </w:pict>
+      </w:r>
+    </w:p>
+    <w:p>
+      <w:pPr>
+        <w:rPr>
+          <w:b/>
+          <w:bCs/>
+        </w:rPr>
+      </w:pPr>
+      <w:r>
+        <w:rPr>
+          <w:rFonts w:ascii="Segoe UI Emoji" w:hAnsi="Segoe UI Emoji" w:cs="Segoe UI Emoji"/>
+          <w:b/>
+          <w:bCs/>
+        </w:rPr>
+        <w:t>🌐</w:t>
+      </w:r>
+      <w:r>
+        <w:rPr>
+          <w:b/>
+          <w:bCs/>
+        </w:rPr>
+        <w:t xml:space="preserve"> Throughput in High-Frequency Trading (HFT)</w:t>
+      </w:r>
+    </w:p>
+    <w:p>
+      <w:pPr>
+        <w:rPr>
+          <w:b/>
+          <w:bCs/>
+        </w:rPr>
+      </w:pPr>
+      <w:r>
+        <w:rPr>
+          <w:b/>
+          <w:bCs/>
+        </w:rPr>
+        <w:t>While not always measured in simple HTTP TPS, High-Frequency Trading (HFT) systems represent the fastest transaction environments in finance, with volumes measured differently:</w:t>
+      </w:r>
+    </w:p>
+    <w:p>
+      <w:pPr>
+        <w:numPr>
+          <w:ilvl w:val="0"/>
+          <w:numId w:val="11"/>
+        </w:numPr>
+        <w:rPr>
+          <w:b/>
+          <w:bCs/>
+        </w:rPr>
+      </w:pPr>
+      <w:r>
+        <w:rPr>
+          <w:b/>
+          <w:bCs/>
+        </w:rPr>
+        <w:t>Speed: HFT systems are optimized for nanosecond-level execution, meaning transactions occur in mere fractions of a second.</w:t>
+      </w:r>
+      <w:r>
+        <w:rPr>
+          <w:b/>
+          <w:bCs/>
+          <w:vertAlign w:val="superscript"/>
+        </w:rPr>
+        <w:t>5</w:t>
+      </w:r>
+    </w:p>
+    <w:p>
+      <w:pPr>
+        <w:numPr>
+          <w:ilvl w:val="0"/>
+          <w:numId w:val="11"/>
+        </w:numPr>
+        <w:rPr>
+          <w:b/>
+          <w:bCs/>
+        </w:rPr>
+      </w:pPr>
+      <w:r>
+        <w:rPr>
+          <w:b/>
+          <w:bCs/>
+        </w:rPr>
+        <w:t>Volume: These systems generate an extremely large number of transactions, often numbering in the millions daily, capitalizing on minimal price fluctuations through automated, algorithmic trading.</w:t>
+      </w:r>
+    </w:p>
+    <w:p>
+      <w:pPr>
+        <w:rPr>
+          <w:b/>
+          <w:bCs/>
+        </w:rPr>
+      </w:pPr>
+      <w:r>
+        <w:rPr>
+          <w:b/>
+          <w:bCs/>
+        </w:rPr>
+        <w:t xml:space="preserve">The primary design goal for HFT systems is ultra-low latency, which is critical for maximizing the number of profitable trades executed over a short </w:t>
+      </w:r>
+      <w:proofErr w:type="gramStart"/>
+      <w:r>
+        <w:rPr>
+          <w:b/>
+          <w:bCs/>
+        </w:rPr>
+        <w:t>time period</w:t>
+      </w:r>
+      <w:proofErr w:type="gramEnd"/>
+      <w:r>
+        <w:rPr>
+          <w:b/>
+          <w:bCs/>
+        </w:rPr>
+        <w:t>.</w:t>
+      </w:r>
+      <w:r>
+        <w:rPr>
+          <w:b/>
+          <w:bCs/>
+          <w:vertAlign w:val="superscript"/>
+        </w:rPr>
+        <w:t>6</w:t>
+      </w:r>
+    </w:p>
+    <w:p>
+      <w:pPr>
+        <w:rPr>
+          <w:b/>
+          <w:bCs/>
+        </w:rPr>
+      </w:pPr>
+      <w:r>
+        <w:rPr>
+          <w:b/>
+          <w:bCs/>
+        </w:rPr>
+        <w:pict w14:anchorId="6F5D0B7B">
+          <v:rect id="_x0000_i1055" style="width:0;height:1.5pt" o:hralign="center" o:hrstd="t" o:hrnoshade="t" o:hr="t" fillcolor="gray" stroked="f"/>
+        </w:pict>
+      </w:r>
+    </w:p>
+    <w:p>
+      <w:pPr>
+        <w:rPr>
+          <w:b/>
+          <w:bCs/>
+        </w:rPr>
+      </w:pPr>
+      <w:r>
+        <w:rPr>
+          <w:b/>
+          <w:bCs/>
+        </w:rPr>
+        <w:t>The video Inside a Real High-Frequency Trading System | HFT Architecture provides a detailed look into the architecture required to achieve the extremely high transaction volumes and low latency characteristic of the fastest financial systems.</w:t>
+      </w:r>
+    </w:p>
+    <w:p>
+      <w:pPr>
+        <w:rPr>
+          <w:b/>
+          <w:bCs/>
+          <w:lang w:val="en-US"/>
+        </w:rPr>
+      </w:pPr>
+    </w:p>
+    <w:p>
+      <w:pPr>
+        <w:rPr>
+          <w:b/>
+          <w:bCs/>
+          <w:color w:val="8EAADB" w:themeColor="accent5" w:themeTint="99"/>
+          <w:lang w:val="en-US"/>
+        </w:rPr>
+      </w:pPr>
+      <w:r>
+        <w:rPr>
+          <w:b/>
+          <w:bCs/>
+          <w:color w:val="8EAADB" w:themeColor="accent5" w:themeTint="99"/>
+          <w:lang w:val="en-US"/>
+        </w:rPr>
+        <w:t xml:space="preserve">What are the typical activities in one transaction of a credit card? Can you break down such elements in nano or milli seconds? I am trying to simulate, as </w:t>
+      </w:r>
+      <w:proofErr w:type="gramStart"/>
+      <w:r>
+        <w:rPr>
+          <w:b/>
+          <w:bCs/>
+          <w:color w:val="8EAADB" w:themeColor="accent5" w:themeTint="99"/>
+          <w:lang w:val="en-US"/>
+        </w:rPr>
+        <w:t>practically near</w:t>
+      </w:r>
+      <w:proofErr w:type="gramEnd"/>
+      <w:r>
+        <w:rPr>
+          <w:b/>
+          <w:bCs/>
+          <w:color w:val="8EAADB" w:themeColor="accent5" w:themeTint="99"/>
+          <w:lang w:val="en-US"/>
+        </w:rPr>
+        <w:t xml:space="preserve"> as possible, a </w:t>
+      </w:r>
+      <w:proofErr w:type="spellStart"/>
+      <w:r>
+        <w:rPr>
+          <w:b/>
+          <w:bCs/>
+          <w:color w:val="8EAADB" w:themeColor="accent5" w:themeTint="99"/>
+          <w:lang w:val="en-US"/>
+        </w:rPr>
+        <w:t>Java+</w:t>
+      </w:r>
+      <w:proofErr w:type="gramStart"/>
+      <w:r>
+        <w:rPr>
+          <w:b/>
+          <w:bCs/>
+          <w:color w:val="8EAADB" w:themeColor="accent5" w:themeTint="99"/>
+          <w:lang w:val="en-US"/>
+        </w:rPr>
+        <w:t>cloud</w:t>
+      </w:r>
+      <w:proofErr w:type="spellEnd"/>
+      <w:r>
+        <w:rPr>
+          <w:b/>
+          <w:bCs/>
+          <w:color w:val="8EAADB" w:themeColor="accent5" w:themeTint="99"/>
+          <w:lang w:val="en-US"/>
+        </w:rPr>
+        <w:t xml:space="preserve"> based</w:t>
+      </w:r>
+      <w:proofErr w:type="gramEnd"/>
+      <w:r>
+        <w:rPr>
+          <w:b/>
+          <w:bCs/>
+          <w:color w:val="8EAADB" w:themeColor="accent5" w:themeTint="99"/>
+          <w:lang w:val="en-US"/>
+        </w:rPr>
+        <w:t xml:space="preserve"> Credit card handling transaction system, </w:t>
+      </w:r>
+      <w:proofErr w:type="gramStart"/>
+      <w:r>
+        <w:rPr>
+          <w:b/>
+          <w:bCs/>
+          <w:color w:val="8EAADB" w:themeColor="accent5" w:themeTint="99"/>
+          <w:lang w:val="en-US"/>
+        </w:rPr>
+        <w:t>in order to</w:t>
+      </w:r>
+      <w:proofErr w:type="gramEnd"/>
+      <w:r>
+        <w:rPr>
+          <w:b/>
+          <w:bCs/>
+          <w:color w:val="8EAADB" w:themeColor="accent5" w:themeTint="99"/>
+          <w:lang w:val="en-US"/>
+        </w:rPr>
+        <w:t xml:space="preserve"> achieve really mind-boggling TPS rates.</w:t>
       </w:r>
     </w:p>
     <w:p>
@@ -2459,7 +3510,7 @@
     <w:p>
       <w:r>
         <w:pict w14:anchorId="5C9B43C6">
-          <v:rect id="_x0000_i1040" style="width:0;height:1.5pt" o:hralign="center" o:hrstd="t" o:hrnoshade="t" o:hr="t" fillcolor="gray" stroked="f"/>
+          <v:rect id="_x0000_i1028" style="width:0;height:1.5pt" o:hralign="center" o:hrstd="t" o:hrnoshade="t" o:hr="t" fillcolor="gray" stroked="f"/>
         </w:pict>
       </w:r>
     </w:p>
@@ -2536,7 +3587,7 @@
     <w:p>
       <w:r>
         <w:pict w14:anchorId="4B83E6A9">
-          <v:rect id="_x0000_i1041" style="width:0;height:1.5pt" o:hralign="center" o:hrstd="t" o:hrnoshade="t" o:hr="t" fillcolor="gray" stroked="f"/>
+          <v:rect id="_x0000_i1029" style="width:0;height:1.5pt" o:hralign="center" o:hrstd="t" o:hrnoshade="t" o:hr="t" fillcolor="gray" stroked="f"/>
         </w:pict>
       </w:r>
     </w:p>
@@ -3821,7 +4872,7 @@
           <w:bCs/>
         </w:rPr>
         <w:pict w14:anchorId="7E5DF96B">
-          <v:rect id="_x0000_i1064" style="width:0;height:1.5pt" o:hralign="center" o:hrstd="t" o:hrnoshade="t" o:hr="t" fillcolor="gray" stroked="f"/>
+          <v:rect id="_x0000_i1030" style="width:0;height:1.5pt" o:hralign="center" o:hrstd="t" o:hrnoshade="t" o:hr="t" fillcolor="gray" stroked="f"/>
         </w:pict>
       </w:r>
     </w:p>
@@ -4316,7 +5367,7 @@
           <w:bCs/>
         </w:rPr>
         <w:pict w14:anchorId="76366ABD">
-          <v:rect id="_x0000_i1065" style="width:0;height:1.5pt" o:hralign="center" o:hrstd="t" o:hrnoshade="t" o:hr="t" fillcolor="gray" stroked="f"/>
+          <v:rect id="_x0000_i1031" style="width:0;height:1.5pt" o:hralign="center" o:hrstd="t" o:hrnoshade="t" o:hr="t" fillcolor="gray" stroked="f"/>
         </w:pict>
       </w:r>
     </w:p>
@@ -4718,7 +5769,7 @@
           <w:bCs/>
         </w:rPr>
         <w:pict w14:anchorId="20A9D204">
-          <v:rect id="_x0000_i1066" style="width:0;height:1.5pt" o:hralign="center" o:hrstd="t" o:hrnoshade="t" o:hr="t" fillcolor="gray" stroked="f"/>
+          <v:rect id="_x0000_i1032" style="width:0;height:1.5pt" o:hralign="center" o:hrstd="t" o:hrnoshade="t" o:hr="t" fillcolor="gray" stroked="f"/>
         </w:pict>
       </w:r>
     </w:p>
@@ -5292,7 +6343,7 @@
     <w:p>
       <w:r>
         <w:pict w14:anchorId="43C7BDCA">
-          <v:rect id="_x0000_i1085" style="width:0;height:1.5pt" o:hralign="center" o:hrstd="t" o:hrnoshade="t" o:hr="t" fillcolor="gray" stroked="f"/>
+          <v:rect id="_x0000_i1033" style="width:0;height:1.5pt" o:hralign="center" o:hrstd="t" o:hrnoshade="t" o:hr="t" fillcolor="gray" stroked="f"/>
         </w:pict>
       </w:r>
     </w:p>
@@ -6008,7 +7059,7 @@
     <w:p>
       <w:r>
         <w:pict w14:anchorId="60C8C034">
-          <v:rect id="_x0000_i1086" style="width:0;height:1.5pt" o:hralign="center" o:hrstd="t" o:hrnoshade="t" o:hr="t" fillcolor="gray" stroked="f"/>
+          <v:rect id="_x0000_i1034" style="width:0;height:1.5pt" o:hralign="center" o:hrstd="t" o:hrnoshade="t" o:hr="t" fillcolor="gray" stroked="f"/>
         </w:pict>
       </w:r>
     </w:p>
@@ -7998,9 +9049,9 @@
     </w:lvl>
   </w:abstractNum>
   <w:abstractNum w:abstractNumId="3" w15:restartNumberingAfterBreak="0">
-    <w:nsid w:val="29752863"/>
+    <w:nsid w:val="258C1F46"/>
     <w:multiLevelType w:val="multilevel"/>
-    <w:tmpl w:val="55B22282"/>
+    <w:tmpl w:val="C290A6E6"/>
     <w:lvl w:ilvl="0">
       <w:start w:val="1"/>
       <w:numFmt w:val="bullet"/>
@@ -8147,6 +9198,304 @@
     </w:lvl>
   </w:abstractNum>
   <w:abstractNum w:abstractNumId="4" w15:restartNumberingAfterBreak="0">
+    <w:nsid w:val="26BB074E"/>
+    <w:multiLevelType w:val="multilevel"/>
+    <w:tmpl w:val="C290A6E6"/>
+    <w:lvl w:ilvl="0">
+      <w:start w:val="1"/>
+      <w:numFmt w:val="bullet"/>
+      <w:lvlText w:val=""/>
+      <w:lvlJc w:val="left"/>
+      <w:pPr>
+        <w:tabs>
+          <w:tab w:val="num" w:pos="720"/>
+        </w:tabs>
+        <w:ind w:left="720" w:hanging="360"/>
+      </w:pPr>
+      <w:rPr>
+        <w:rFonts w:ascii="Symbol" w:hAnsi="Symbol" w:hint="default"/>
+        <w:sz w:val="20"/>
+      </w:rPr>
+    </w:lvl>
+    <w:lvl w:ilvl="1" w:tentative="1">
+      <w:start w:val="1"/>
+      <w:numFmt w:val="bullet"/>
+      <w:lvlText w:val="o"/>
+      <w:lvlJc w:val="left"/>
+      <w:pPr>
+        <w:tabs>
+          <w:tab w:val="num" w:pos="1440"/>
+        </w:tabs>
+        <w:ind w:left="1440" w:hanging="360"/>
+      </w:pPr>
+      <w:rPr>
+        <w:rFonts w:ascii="Courier New" w:hAnsi="Courier New" w:hint="default"/>
+        <w:sz w:val="20"/>
+      </w:rPr>
+    </w:lvl>
+    <w:lvl w:ilvl="2" w:tentative="1">
+      <w:start w:val="1"/>
+      <w:numFmt w:val="bullet"/>
+      <w:lvlText w:val=""/>
+      <w:lvlJc w:val="left"/>
+      <w:pPr>
+        <w:tabs>
+          <w:tab w:val="num" w:pos="2160"/>
+        </w:tabs>
+        <w:ind w:left="2160" w:hanging="360"/>
+      </w:pPr>
+      <w:rPr>
+        <w:rFonts w:ascii="Wingdings" w:hAnsi="Wingdings" w:hint="default"/>
+        <w:sz w:val="20"/>
+      </w:rPr>
+    </w:lvl>
+    <w:lvl w:ilvl="3" w:tentative="1">
+      <w:start w:val="1"/>
+      <w:numFmt w:val="bullet"/>
+      <w:lvlText w:val=""/>
+      <w:lvlJc w:val="left"/>
+      <w:pPr>
+        <w:tabs>
+          <w:tab w:val="num" w:pos="2880"/>
+        </w:tabs>
+        <w:ind w:left="2880" w:hanging="360"/>
+      </w:pPr>
+      <w:rPr>
+        <w:rFonts w:ascii="Wingdings" w:hAnsi="Wingdings" w:hint="default"/>
+        <w:sz w:val="20"/>
+      </w:rPr>
+    </w:lvl>
+    <w:lvl w:ilvl="4" w:tentative="1">
+      <w:start w:val="1"/>
+      <w:numFmt w:val="bullet"/>
+      <w:lvlText w:val=""/>
+      <w:lvlJc w:val="left"/>
+      <w:pPr>
+        <w:tabs>
+          <w:tab w:val="num" w:pos="3600"/>
+        </w:tabs>
+        <w:ind w:left="3600" w:hanging="360"/>
+      </w:pPr>
+      <w:rPr>
+        <w:rFonts w:ascii="Wingdings" w:hAnsi="Wingdings" w:hint="default"/>
+        <w:sz w:val="20"/>
+      </w:rPr>
+    </w:lvl>
+    <w:lvl w:ilvl="5" w:tentative="1">
+      <w:start w:val="1"/>
+      <w:numFmt w:val="bullet"/>
+      <w:lvlText w:val=""/>
+      <w:lvlJc w:val="left"/>
+      <w:pPr>
+        <w:tabs>
+          <w:tab w:val="num" w:pos="4320"/>
+        </w:tabs>
+        <w:ind w:left="4320" w:hanging="360"/>
+      </w:pPr>
+      <w:rPr>
+        <w:rFonts w:ascii="Wingdings" w:hAnsi="Wingdings" w:hint="default"/>
+        <w:sz w:val="20"/>
+      </w:rPr>
+    </w:lvl>
+    <w:lvl w:ilvl="6" w:tentative="1">
+      <w:start w:val="1"/>
+      <w:numFmt w:val="bullet"/>
+      <w:lvlText w:val=""/>
+      <w:lvlJc w:val="left"/>
+      <w:pPr>
+        <w:tabs>
+          <w:tab w:val="num" w:pos="5040"/>
+        </w:tabs>
+        <w:ind w:left="5040" w:hanging="360"/>
+      </w:pPr>
+      <w:rPr>
+        <w:rFonts w:ascii="Wingdings" w:hAnsi="Wingdings" w:hint="default"/>
+        <w:sz w:val="20"/>
+      </w:rPr>
+    </w:lvl>
+    <w:lvl w:ilvl="7" w:tentative="1">
+      <w:start w:val="1"/>
+      <w:numFmt w:val="bullet"/>
+      <w:lvlText w:val=""/>
+      <w:lvlJc w:val="left"/>
+      <w:pPr>
+        <w:tabs>
+          <w:tab w:val="num" w:pos="5760"/>
+        </w:tabs>
+        <w:ind w:left="5760" w:hanging="360"/>
+      </w:pPr>
+      <w:rPr>
+        <w:rFonts w:ascii="Wingdings" w:hAnsi="Wingdings" w:hint="default"/>
+        <w:sz w:val="20"/>
+      </w:rPr>
+    </w:lvl>
+    <w:lvl w:ilvl="8" w:tentative="1">
+      <w:start w:val="1"/>
+      <w:numFmt w:val="bullet"/>
+      <w:lvlText w:val=""/>
+      <w:lvlJc w:val="left"/>
+      <w:pPr>
+        <w:tabs>
+          <w:tab w:val="num" w:pos="6480"/>
+        </w:tabs>
+        <w:ind w:left="6480" w:hanging="360"/>
+      </w:pPr>
+      <w:rPr>
+        <w:rFonts w:ascii="Wingdings" w:hAnsi="Wingdings" w:hint="default"/>
+        <w:sz w:val="20"/>
+      </w:rPr>
+    </w:lvl>
+  </w:abstractNum>
+  <w:abstractNum w:abstractNumId="5" w15:restartNumberingAfterBreak="0">
+    <w:nsid w:val="29752863"/>
+    <w:multiLevelType w:val="multilevel"/>
+    <w:tmpl w:val="55B22282"/>
+    <w:lvl w:ilvl="0">
+      <w:start w:val="1"/>
+      <w:numFmt w:val="bullet"/>
+      <w:lvlText w:val=""/>
+      <w:lvlJc w:val="left"/>
+      <w:pPr>
+        <w:tabs>
+          <w:tab w:val="num" w:pos="720"/>
+        </w:tabs>
+        <w:ind w:left="720" w:hanging="360"/>
+      </w:pPr>
+      <w:rPr>
+        <w:rFonts w:ascii="Symbol" w:hAnsi="Symbol" w:hint="default"/>
+        <w:sz w:val="20"/>
+      </w:rPr>
+    </w:lvl>
+    <w:lvl w:ilvl="1" w:tentative="1">
+      <w:start w:val="1"/>
+      <w:numFmt w:val="bullet"/>
+      <w:lvlText w:val="o"/>
+      <w:lvlJc w:val="left"/>
+      <w:pPr>
+        <w:tabs>
+          <w:tab w:val="num" w:pos="1440"/>
+        </w:tabs>
+        <w:ind w:left="1440" w:hanging="360"/>
+      </w:pPr>
+      <w:rPr>
+        <w:rFonts w:ascii="Courier New" w:hAnsi="Courier New" w:hint="default"/>
+        <w:sz w:val="20"/>
+      </w:rPr>
+    </w:lvl>
+    <w:lvl w:ilvl="2" w:tentative="1">
+      <w:start w:val="1"/>
+      <w:numFmt w:val="bullet"/>
+      <w:lvlText w:val=""/>
+      <w:lvlJc w:val="left"/>
+      <w:pPr>
+        <w:tabs>
+          <w:tab w:val="num" w:pos="2160"/>
+        </w:tabs>
+        <w:ind w:left="2160" w:hanging="360"/>
+      </w:pPr>
+      <w:rPr>
+        <w:rFonts w:ascii="Wingdings" w:hAnsi="Wingdings" w:hint="default"/>
+        <w:sz w:val="20"/>
+      </w:rPr>
+    </w:lvl>
+    <w:lvl w:ilvl="3" w:tentative="1">
+      <w:start w:val="1"/>
+      <w:numFmt w:val="bullet"/>
+      <w:lvlText w:val=""/>
+      <w:lvlJc w:val="left"/>
+      <w:pPr>
+        <w:tabs>
+          <w:tab w:val="num" w:pos="2880"/>
+        </w:tabs>
+        <w:ind w:left="2880" w:hanging="360"/>
+      </w:pPr>
+      <w:rPr>
+        <w:rFonts w:ascii="Wingdings" w:hAnsi="Wingdings" w:hint="default"/>
+        <w:sz w:val="20"/>
+      </w:rPr>
+    </w:lvl>
+    <w:lvl w:ilvl="4" w:tentative="1">
+      <w:start w:val="1"/>
+      <w:numFmt w:val="bullet"/>
+      <w:lvlText w:val=""/>
+      <w:lvlJc w:val="left"/>
+      <w:pPr>
+        <w:tabs>
+          <w:tab w:val="num" w:pos="3600"/>
+        </w:tabs>
+        <w:ind w:left="3600" w:hanging="360"/>
+      </w:pPr>
+      <w:rPr>
+        <w:rFonts w:ascii="Wingdings" w:hAnsi="Wingdings" w:hint="default"/>
+        <w:sz w:val="20"/>
+      </w:rPr>
+    </w:lvl>
+    <w:lvl w:ilvl="5" w:tentative="1">
+      <w:start w:val="1"/>
+      <w:numFmt w:val="bullet"/>
+      <w:lvlText w:val=""/>
+      <w:lvlJc w:val="left"/>
+      <w:pPr>
+        <w:tabs>
+          <w:tab w:val="num" w:pos="4320"/>
+        </w:tabs>
+        <w:ind w:left="4320" w:hanging="360"/>
+      </w:pPr>
+      <w:rPr>
+        <w:rFonts w:ascii="Wingdings" w:hAnsi="Wingdings" w:hint="default"/>
+        <w:sz w:val="20"/>
+      </w:rPr>
+    </w:lvl>
+    <w:lvl w:ilvl="6" w:tentative="1">
+      <w:start w:val="1"/>
+      <w:numFmt w:val="bullet"/>
+      <w:lvlText w:val=""/>
+      <w:lvlJc w:val="left"/>
+      <w:pPr>
+        <w:tabs>
+          <w:tab w:val="num" w:pos="5040"/>
+        </w:tabs>
+        <w:ind w:left="5040" w:hanging="360"/>
+      </w:pPr>
+      <w:rPr>
+        <w:rFonts w:ascii="Wingdings" w:hAnsi="Wingdings" w:hint="default"/>
+        <w:sz w:val="20"/>
+      </w:rPr>
+    </w:lvl>
+    <w:lvl w:ilvl="7" w:tentative="1">
+      <w:start w:val="1"/>
+      <w:numFmt w:val="bullet"/>
+      <w:lvlText w:val=""/>
+      <w:lvlJc w:val="left"/>
+      <w:pPr>
+        <w:tabs>
+          <w:tab w:val="num" w:pos="5760"/>
+        </w:tabs>
+        <w:ind w:left="5760" w:hanging="360"/>
+      </w:pPr>
+      <w:rPr>
+        <w:rFonts w:ascii="Wingdings" w:hAnsi="Wingdings" w:hint="default"/>
+        <w:sz w:val="20"/>
+      </w:rPr>
+    </w:lvl>
+    <w:lvl w:ilvl="8" w:tentative="1">
+      <w:start w:val="1"/>
+      <w:numFmt w:val="bullet"/>
+      <w:lvlText w:val=""/>
+      <w:lvlJc w:val="left"/>
+      <w:pPr>
+        <w:tabs>
+          <w:tab w:val="num" w:pos="6480"/>
+        </w:tabs>
+        <w:ind w:left="6480" w:hanging="360"/>
+      </w:pPr>
+      <w:rPr>
+        <w:rFonts w:ascii="Wingdings" w:hAnsi="Wingdings" w:hint="default"/>
+        <w:sz w:val="20"/>
+      </w:rPr>
+    </w:lvl>
+  </w:abstractNum>
+  <w:abstractNum w:abstractNumId="6" w15:restartNumberingAfterBreak="0">
     <w:nsid w:val="2D444A8A"/>
     <w:multiLevelType w:val="multilevel"/>
     <w:tmpl w:val="B8D2E402"/>
@@ -8259,7 +9608,7 @@
       </w:pPr>
     </w:lvl>
   </w:abstractNum>
-  <w:abstractNum w:abstractNumId="5" w15:restartNumberingAfterBreak="0">
+  <w:abstractNum w:abstractNumId="7" w15:restartNumberingAfterBreak="0">
     <w:nsid w:val="4B9F6A28"/>
     <w:multiLevelType w:val="multilevel"/>
     <w:tmpl w:val="97668BD0"/>
@@ -8408,7 +9757,7 @@
       </w:rPr>
     </w:lvl>
   </w:abstractNum>
-  <w:abstractNum w:abstractNumId="6" w15:restartNumberingAfterBreak="0">
+  <w:abstractNum w:abstractNumId="8" w15:restartNumberingAfterBreak="0">
     <w:nsid w:val="5B1E5C96"/>
     <w:multiLevelType w:val="multilevel"/>
     <w:tmpl w:val="58DC5610"/>
@@ -8557,7 +9906,7 @@
       </w:rPr>
     </w:lvl>
   </w:abstractNum>
-  <w:abstractNum w:abstractNumId="7" w15:restartNumberingAfterBreak="0">
+  <w:abstractNum w:abstractNumId="9" w15:restartNumberingAfterBreak="0">
     <w:nsid w:val="60FD281F"/>
     <w:multiLevelType w:val="multilevel"/>
     <w:tmpl w:val="EDEC0AEE"/>
@@ -8706,7 +10055,7 @@
       </w:rPr>
     </w:lvl>
   </w:abstractNum>
-  <w:abstractNum w:abstractNumId="8" w15:restartNumberingAfterBreak="0">
+  <w:abstractNum w:abstractNumId="10" w15:restartNumberingAfterBreak="0">
     <w:nsid w:val="7D3B1443"/>
     <w:multiLevelType w:val="multilevel"/>
     <w:tmpl w:val="295C2D50"/>
@@ -8856,31 +10205,37 @@
     </w:lvl>
   </w:abstractNum>
   <w:num w:numId="1" w16cid:durableId="1761294194">
+    <w:abstractNumId w:val="9"/>
+  </w:num>
+  <w:num w:numId="2" w16cid:durableId="500043028">
     <w:abstractNumId w:val="7"/>
   </w:num>
-  <w:num w:numId="2" w16cid:durableId="500043028">
-    <w:abstractNumId w:val="5"/>
-  </w:num>
   <w:num w:numId="3" w16cid:durableId="1816288867">
-    <w:abstractNumId w:val="8"/>
+    <w:abstractNumId w:val="10"/>
   </w:num>
   <w:num w:numId="4" w16cid:durableId="1255165494">
     <w:abstractNumId w:val="1"/>
   </w:num>
   <w:num w:numId="5" w16cid:durableId="1380787251">
-    <w:abstractNumId w:val="4"/>
+    <w:abstractNumId w:val="6"/>
   </w:num>
   <w:num w:numId="6" w16cid:durableId="214393522">
-    <w:abstractNumId w:val="6"/>
+    <w:abstractNumId w:val="8"/>
   </w:num>
   <w:num w:numId="7" w16cid:durableId="1830977285">
     <w:abstractNumId w:val="0"/>
   </w:num>
   <w:num w:numId="8" w16cid:durableId="471027287">
-    <w:abstractNumId w:val="3"/>
+    <w:abstractNumId w:val="5"/>
   </w:num>
   <w:num w:numId="9" w16cid:durableId="341129782">
     <w:abstractNumId w:val="2"/>
+  </w:num>
+  <w:num w:numId="10" w16cid:durableId="1986472861">
+    <w:abstractNumId w:val="4"/>
+  </w:num>
+  <w:num w:numId="11" w16cid:durableId="1968269176">
+    <w:abstractNumId w:val="3"/>
   </w:num>
 </w:numbering>
 </file>
@@ -9810,6 +11165,19 @@
       <w:spacing w:after="0" w:line="240" w:lineRule="auto"/>
     </w:pPr>
   </w:style>
+  <w:style w:type="paragraph" w:styleId="NormalWeb">
+    <w:name w:val="Normal (Web)"/>
+    <w:basedOn w:val="Normal"/>
+    <w:uiPriority w:val="99"/>
+    <w:semiHidden/>
+    <w:unhideWhenUsed/>
+    <w:rsid w:val="005A2E57"/>
+    <w:rPr>
+      <w:rFonts w:ascii="Times New Roman" w:hAnsi="Times New Roman" w:cs="Times New Roman"/>
+      <w:sz w:val="24"/>
+      <w:szCs w:val="24"/>
+    </w:rPr>
+  </w:style>
 </w:styles>
 </file>
 

</xml_diff>

<commit_message>
High vol. doc: added Java programming viewpoint.
</commit_message>
<xml_diff>
--- a/High_Volume_Low_Latency_Transaction Architectures.docx
+++ b/High_Volume_Low_Latency_Transaction Architectures.docx
@@ -119,7 +119,7 @@
           <w:bCs/>
         </w:rPr>
         <w:pict w14:anchorId="24303C7D">
-          <v:rect id="_x0000_i1053" style="width:0;height:1.5pt" o:hralign="center" o:hrstd="t" o:hrnoshade="t" o:hr="t" fillcolor="gray" stroked="f"/>
+          <v:rect id="_x0000_i1025" style="width:0;height:1.5pt" o:hralign="center" o:hrstd="t" o:hrnoshade="t" o:hr="t" fillcolor="gray" stroked="f"/>
         </w:pict>
       </w:r>
     </w:p>
@@ -810,7 +810,7 @@
           <w:bCs/>
         </w:rPr>
         <w:pict w14:anchorId="698D5E06">
-          <v:rect id="_x0000_i1054" style="width:0;height:1.5pt" o:hralign="center" o:hrstd="t" o:hrnoshade="t" o:hr="t" fillcolor="gray" stroked="f"/>
+          <v:rect id="_x0000_i1026" style="width:0;height:1.5pt" o:hralign="center" o:hrstd="t" o:hrnoshade="t" o:hr="t" fillcolor="gray" stroked="f"/>
         </w:pict>
       </w:r>
     </w:p>
@@ -950,7 +950,7 @@
           <w:bCs/>
         </w:rPr>
         <w:pict w14:anchorId="6F5D0B7B">
-          <v:rect id="_x0000_i1055" style="width:0;height:1.5pt" o:hralign="center" o:hrstd="t" o:hrnoshade="t" o:hr="t" fillcolor="gray" stroked="f"/>
+          <v:rect id="_x0000_i1027" style="width:0;height:1.5pt" o:hralign="center" o:hrstd="t" o:hrnoshade="t" o:hr="t" fillcolor="gray" stroked="f"/>
         </w:pict>
       </w:r>
     </w:p>
@@ -1298,7 +1298,7 @@
     <w:p>
       <w:r>
         <w:pict w14:anchorId="6AFB44AC">
-          <v:rect id="_x0000_i1025" style="width:0;height:1.5pt" o:hralign="center" o:hrstd="t" o:hrnoshade="t" o:hr="t" fillcolor="gray" stroked="f"/>
+          <v:rect id="_x0000_i1028" style="width:0;height:1.5pt" o:hralign="center" o:hrstd="t" o:hrnoshade="t" o:hr="t" fillcolor="gray" stroked="f"/>
         </w:pict>
       </w:r>
     </w:p>
@@ -2788,7 +2788,7 @@
     <w:p>
       <w:r>
         <w:pict w14:anchorId="44867704">
-          <v:rect id="_x0000_i1026" style="width:0;height:1.5pt" o:hralign="center" o:hrstd="t" o:hrnoshade="t" o:hr="t" fillcolor="gray" stroked="f"/>
+          <v:rect id="_x0000_i1029" style="width:0;height:1.5pt" o:hralign="center" o:hrstd="t" o:hrnoshade="t" o:hr="t" fillcolor="gray" stroked="f"/>
         </w:pict>
       </w:r>
     </w:p>
@@ -3187,7 +3187,7 @@
     <w:p>
       <w:r>
         <w:pict w14:anchorId="7590AA18">
-          <v:rect id="_x0000_i1027" style="width:0;height:1.5pt" o:hralign="center" o:hrstd="t" o:hrnoshade="t" o:hr="t" fillcolor="gray" stroked="f"/>
+          <v:rect id="_x0000_i1030" style="width:0;height:1.5pt" o:hralign="center" o:hrstd="t" o:hrnoshade="t" o:hr="t" fillcolor="gray" stroked="f"/>
         </w:pict>
       </w:r>
     </w:p>
@@ -3510,7 +3510,7 @@
     <w:p>
       <w:r>
         <w:pict w14:anchorId="5C9B43C6">
-          <v:rect id="_x0000_i1028" style="width:0;height:1.5pt" o:hralign="center" o:hrstd="t" o:hrnoshade="t" o:hr="t" fillcolor="gray" stroked="f"/>
+          <v:rect id="_x0000_i1031" style="width:0;height:1.5pt" o:hralign="center" o:hrstd="t" o:hrnoshade="t" o:hr="t" fillcolor="gray" stroked="f"/>
         </w:pict>
       </w:r>
     </w:p>
@@ -3587,7 +3587,7 @@
     <w:p>
       <w:r>
         <w:pict w14:anchorId="4B83E6A9">
-          <v:rect id="_x0000_i1029" style="width:0;height:1.5pt" o:hralign="center" o:hrstd="t" o:hrnoshade="t" o:hr="t" fillcolor="gray" stroked="f"/>
+          <v:rect id="_x0000_i1032" style="width:0;height:1.5pt" o:hralign="center" o:hrstd="t" o:hrnoshade="t" o:hr="t" fillcolor="gray" stroked="f"/>
         </w:pict>
       </w:r>
     </w:p>
@@ -4738,6 +4738,8 @@
           <w:b/>
           <w:bCs/>
           <w:color w:val="2E74B5" w:themeColor="accent1" w:themeShade="BF"/>
+          <w:sz w:val="24"/>
+          <w:szCs w:val="24"/>
         </w:rPr>
       </w:pPr>
       <w:r>
@@ -4745,6 +4747,8 @@
           <w:b/>
           <w:bCs/>
           <w:color w:val="2E74B5" w:themeColor="accent1" w:themeShade="BF"/>
+          <w:sz w:val="24"/>
+          <w:szCs w:val="24"/>
         </w:rPr>
         <w:t xml:space="preserve">Can you discuss few </w:t>
       </w:r>
@@ -4754,6 +4758,8 @@
           <w:b/>
           <w:bCs/>
           <w:color w:val="2E74B5" w:themeColor="accent1" w:themeShade="BF"/>
+          <w:sz w:val="24"/>
+          <w:szCs w:val="24"/>
         </w:rPr>
         <w:t>Java</w:t>
       </w:r>
@@ -4763,30 +4769,18 @@
           <w:b/>
           <w:bCs/>
           <w:color w:val="2E74B5" w:themeColor="accent1" w:themeShade="BF"/>
-        </w:rPr>
-        <w:t xml:space="preserve"> based options to handle "Asynchronou</w:t>
+          <w:sz w:val="24"/>
+          <w:szCs w:val="24"/>
+        </w:rPr>
+        <w:t xml:space="preserve"> based options to handle "Asynchronous I/O to manage thousands of concurrent connections efficiently"?</w:t>
       </w:r>
       <w:r>
         <w:rPr>
           <w:b/>
           <w:bCs/>
           <w:color w:val="2E74B5" w:themeColor="accent1" w:themeShade="BF"/>
-        </w:rPr>
-        <w:t>s</w:t>
-      </w:r>
-      <w:r>
-        <w:rPr>
-          <w:b/>
-          <w:bCs/>
-          <w:color w:val="2E74B5" w:themeColor="accent1" w:themeShade="BF"/>
-        </w:rPr>
-        <w:t xml:space="preserve"> I/O to manage thousands of concurrent connections efficiently"?</w:t>
-      </w:r>
-      <w:r>
-        <w:rPr>
-          <w:b/>
-          <w:bCs/>
-          <w:color w:val="2E74B5" w:themeColor="accent1" w:themeShade="BF"/>
+          <w:sz w:val="24"/>
+          <w:szCs w:val="24"/>
         </w:rPr>
         <w:t xml:space="preserve"> </w:t>
       </w:r>
@@ -4872,7 +4866,7 @@
           <w:bCs/>
         </w:rPr>
         <w:pict w14:anchorId="7E5DF96B">
-          <v:rect id="_x0000_i1030" style="width:0;height:1.5pt" o:hralign="center" o:hrstd="t" o:hrnoshade="t" o:hr="t" fillcolor="gray" stroked="f"/>
+          <v:rect id="_x0000_i1033" style="width:0;height:1.5pt" o:hralign="center" o:hrstd="t" o:hrnoshade="t" o:hr="t" fillcolor="gray" stroked="f"/>
         </w:pict>
       </w:r>
     </w:p>
@@ -5367,7 +5361,7 @@
           <w:bCs/>
         </w:rPr>
         <w:pict w14:anchorId="76366ABD">
-          <v:rect id="_x0000_i1031" style="width:0;height:1.5pt" o:hralign="center" o:hrstd="t" o:hrnoshade="t" o:hr="t" fillcolor="gray" stroked="f"/>
+          <v:rect id="_x0000_i1034" style="width:0;height:1.5pt" o:hralign="center" o:hrstd="t" o:hrnoshade="t" o:hr="t" fillcolor="gray" stroked="f"/>
         </w:pict>
       </w:r>
     </w:p>
@@ -5769,7 +5763,7 @@
           <w:bCs/>
         </w:rPr>
         <w:pict w14:anchorId="20A9D204">
-          <v:rect id="_x0000_i1032" style="width:0;height:1.5pt" o:hralign="center" o:hrstd="t" o:hrnoshade="t" o:hr="t" fillcolor="gray" stroked="f"/>
+          <v:rect id="_x0000_i1035" style="width:0;height:1.5pt" o:hralign="center" o:hrstd="t" o:hrnoshade="t" o:hr="t" fillcolor="gray" stroked="f"/>
         </w:pict>
       </w:r>
     </w:p>
@@ -6290,6 +6284,8 @@
           <w:b/>
           <w:bCs/>
           <w:color w:val="2E74B5" w:themeColor="accent1" w:themeShade="BF"/>
+          <w:sz w:val="24"/>
+          <w:szCs w:val="24"/>
         </w:rPr>
       </w:pPr>
       <w:r>
@@ -6297,16 +6293,28 @@
           <w:b/>
           <w:bCs/>
           <w:color w:val="2E74B5" w:themeColor="accent1" w:themeShade="BF"/>
-        </w:rPr>
-        <w:t>Give me an example of Card data input/encryption.</w:t>
-      </w:r>
-    </w:p>
-    <w:p>
-      <w:pPr>
+          <w:sz w:val="24"/>
+          <w:szCs w:val="24"/>
+        </w:rPr>
+        <w:t>E</w:t>
+      </w:r>
+      <w:r>
         <w:rPr>
           <w:b/>
           <w:bCs/>
           <w:color w:val="2E74B5" w:themeColor="accent1" w:themeShade="BF"/>
+          <w:sz w:val="24"/>
+          <w:szCs w:val="24"/>
+        </w:rPr>
+        <w:t>xample of Card data input/encryption.</w:t>
+      </w:r>
+    </w:p>
+    <w:p>
+      <w:pPr>
+        <w:rPr>
+          <w:b/>
+          <w:bCs/>
+          <w:color w:val="2E74B5" w:themeColor="accent1" w:themeShade="BF"/>
         </w:rPr>
       </w:pPr>
     </w:p>
@@ -6343,7 +6351,7 @@
     <w:p>
       <w:r>
         <w:pict w14:anchorId="43C7BDCA">
-          <v:rect id="_x0000_i1033" style="width:0;height:1.5pt" o:hralign="center" o:hrstd="t" o:hrnoshade="t" o:hr="t" fillcolor="gray" stroked="f"/>
+          <v:rect id="_x0000_i1036" style="width:0;height:1.5pt" o:hralign="center" o:hrstd="t" o:hrnoshade="t" o:hr="t" fillcolor="gray" stroked="f"/>
         </w:pict>
       </w:r>
     </w:p>
@@ -7059,7 +7067,7 @@
     <w:p>
       <w:r>
         <w:pict w14:anchorId="60C8C034">
-          <v:rect id="_x0000_i1034" style="width:0;height:1.5pt" o:hralign="center" o:hrstd="t" o:hrnoshade="t" o:hr="t" fillcolor="gray" stroked="f"/>
+          <v:rect id="_x0000_i1037" style="width:0;height:1.5pt" o:hralign="center" o:hrstd="t" o:hrnoshade="t" o:hr="t" fillcolor="gray" stroked="f"/>
         </w:pict>
       </w:r>
     </w:p>
@@ -8622,6 +8630,744 @@
       </w:r>
       <w:r>
         <w:t>, you achieve high security (no raw PAN on your server) and maximum performance (your code deals with lightweight, non-sensitive string tokens).</w:t>
+      </w:r>
+    </w:p>
+    <w:p/>
+    <w:p>
+      <w:pPr>
+        <w:rPr>
+          <w:b/>
+          <w:color w:val="000000" w:themeColor="text1"/>
+          <w:sz w:val="32"/>
+          <w:szCs w:val="32"/>
+          <w14:shadow w14:blurRad="12700" w14:dist="38100" w14:dir="2700000" w14:sx="100000" w14:sy="100000" w14:kx="0" w14:ky="0" w14:algn="tl">
+            <w14:schemeClr w14:val="bg1">
+              <w14:lumMod w14:val="50000"/>
+            </w14:schemeClr>
+          </w14:shadow>
+          <w14:textOutline w14:w="9525" w14:cap="flat" w14:cmpd="sng" w14:algn="ctr">
+            <w14:solidFill>
+              <w14:schemeClr w14:val="bg1"/>
+            </w14:solidFill>
+            <w14:prstDash w14:val="solid"/>
+            <w14:round/>
+          </w14:textOutline>
+        </w:rPr>
+      </w:pPr>
+      <w:r>
+        <w:rPr>
+          <w:b/>
+          <w:color w:val="000000" w:themeColor="text1"/>
+          <w:sz w:val="32"/>
+          <w:szCs w:val="32"/>
+          <w14:shadow w14:blurRad="12700" w14:dist="38100" w14:dir="2700000" w14:sx="100000" w14:sy="100000" w14:kx="0" w14:ky="0" w14:algn="tl">
+            <w14:schemeClr w14:val="bg1">
+              <w14:lumMod w14:val="50000"/>
+            </w14:schemeClr>
+          </w14:shadow>
+          <w14:textOutline w14:w="9525" w14:cap="flat" w14:cmpd="sng" w14:algn="ctr">
+            <w14:solidFill>
+              <w14:schemeClr w14:val="bg1"/>
+            </w14:solidFill>
+            <w14:prstDash w14:val="solid"/>
+            <w14:round/>
+          </w14:textOutline>
+        </w:rPr>
+        <w:t>Java viewpoint:</w:t>
+      </w:r>
+    </w:p>
+    <w:p>
+      <w:pPr>
+        <w:rPr>
+          <w:b/>
+          <w:bCs/>
+        </w:rPr>
+      </w:pPr>
+      <w:r>
+        <w:rPr>
+          <w:b/>
+          <w:bCs/>
+        </w:rPr>
+        <w:t>Optimising Java Applications in Fintech: A Guide to Performance Tuning and Scalability</w:t>
+      </w:r>
+    </w:p>
+    <w:p>
+      <w:r>
+        <w:t>  05 August 2024 </w:t>
+      </w:r>
+      <w:hyperlink r:id="rId5" w:anchor="comments" w:history="1">
+        <w:r>
+          <w:rPr>
+            <w:rStyle w:val="Hyperlink"/>
+            <w:b/>
+            <w:bCs/>
+          </w:rPr>
+          <w:t>Be the first to comment</w:t>
+        </w:r>
+      </w:hyperlink>
+    </w:p>
+    <w:p>
+      <w:pPr>
+        <w:rPr>
+          <w:rStyle w:val="Hyperlink"/>
+          <w:b/>
+          <w:bCs/>
+        </w:rPr>
+      </w:pPr>
+      <w:r>
+        <w:fldChar w:fldCharType="begin"/>
+      </w:r>
+      <w:r>
+        <w:instrText>HYPERLINK "https://www.finextra.com/bloggers/162860"</w:instrText>
+      </w:r>
+      <w:r>
+        <w:fldChar w:fldCharType="separate"/>
+      </w:r>
+    </w:p>
+    <w:p>
+      <w:pPr>
+        <w:rPr>
+          <w:rStyle w:val="Hyperlink"/>
+        </w:rPr>
+      </w:pPr>
+      <w:r>
+        <w:rPr>
+          <w:rStyle w:val="Hyperlink"/>
+          <w:b/>
+          <w:bCs/>
+        </w:rPr>
+        <w:drawing>
+          <wp:inline distT="0" distB="0" distL="0" distR="0" wp14:anchorId="155E4E52" wp14:editId="27197FC4">
+            <wp:extent cx="1905000" cy="1905000"/>
+            <wp:effectExtent l="0" t="0" r="0" b="0"/>
+            <wp:docPr id="563315496" name="Picture 2" descr="Grigorii Alekseev">
+              <a:hlinkClick xmlns:a="http://schemas.openxmlformats.org/drawingml/2006/main" r:id="rId6"/>
+            </wp:docPr>
+            <wp:cNvGraphicFramePr>
+              <a:graphicFrameLocks xmlns:a="http://schemas.openxmlformats.org/drawingml/2006/main" noChangeAspect="1"/>
+            </wp:cNvGraphicFramePr>
+            <a:graphic xmlns:a="http://schemas.openxmlformats.org/drawingml/2006/main">
+              <a:graphicData uri="http://schemas.openxmlformats.org/drawingml/2006/picture">
+                <pic:pic xmlns:pic="http://schemas.openxmlformats.org/drawingml/2006/picture">
+                  <pic:nvPicPr>
+                    <pic:cNvPr id="0" name="ctl00_ctl00_body_main_BlogProfileForm_iBlogger" descr="Grigorii Alekseev">
+                      <a:hlinkClick r:id="rId6"/>
+                    </pic:cNvPr>
+                    <pic:cNvPicPr>
+                      <a:picLocks noChangeAspect="1" noChangeArrowheads="1"/>
+                    </pic:cNvPicPr>
+                  </pic:nvPicPr>
+                  <pic:blipFill>
+                    <a:blip r:embed="rId7">
+                      <a:extLst>
+                        <a:ext uri="{28A0092B-C50C-407E-A947-70E740481C1C}">
+                          <a14:useLocalDpi xmlns:a14="http://schemas.microsoft.com/office/drawing/2010/main" val="0"/>
+                        </a:ext>
+                      </a:extLst>
+                    </a:blip>
+                    <a:srcRect/>
+                    <a:stretch>
+                      <a:fillRect/>
+                    </a:stretch>
+                  </pic:blipFill>
+                  <pic:spPr bwMode="auto">
+                    <a:xfrm>
+                      <a:off x="0" y="0"/>
+                      <a:ext cx="1905000" cy="1905000"/>
+                    </a:xfrm>
+                    <a:prstGeom prst="rect">
+                      <a:avLst/>
+                    </a:prstGeom>
+                    <a:noFill/>
+                    <a:ln>
+                      <a:noFill/>
+                    </a:ln>
+                  </pic:spPr>
+                </pic:pic>
+              </a:graphicData>
+            </a:graphic>
+          </wp:inline>
+        </w:drawing>
+      </w:r>
+    </w:p>
+    <w:p>
+      <w:r>
+        <w:fldChar w:fldCharType="end"/>
+      </w:r>
+    </w:p>
+    <w:p>
+      <w:pPr>
+        <w:rPr>
+          <w:b/>
+          <w:bCs/>
+        </w:rPr>
+      </w:pPr>
+      <w:r>
+        <w:rPr>
+          <w:b/>
+          <w:bCs/>
+        </w:rPr>
+        <w:t>Grigorii Alekseev</w:t>
+      </w:r>
+      <w:r>
+        <w:rPr>
+          <w:b/>
+          <w:bCs/>
+        </w:rPr>
+        <w:t xml:space="preserve">/ </w:t>
+      </w:r>
+      <w:r>
+        <w:t>Software Development Engineer</w:t>
+      </w:r>
+    </w:p>
+    <w:p>
+      <w:r>
+        <w:t>When it comes to backend development in the fintech sector, Java remains a popular choice due to its robust ecosystem and extensive library support. For professionals managing high-stakes financial systems, ensuring Java apps perform optimally is a fundamental task. These systems must handle large volumes of transactions swiftly and accurately to meet both market demands and regulatory standards.</w:t>
+      </w:r>
+    </w:p>
+    <w:p>
+      <w:r>
+        <w:t>In these circumstances, the necessity of fine-tuning Java for performance and scalability cannot be stressed hard enough. In this article, I offer to your attention effective strategies to enhance your Java apps, focusing on areas like performance bottlenecks and scalable solutions. Let’s start by pinpointing common challenges and addressing them with effective tuning techniques.</w:t>
+      </w:r>
+    </w:p>
+    <w:p>
+      <w:r>
+        <w:rPr>
+          <w:b/>
+          <w:bCs/>
+        </w:rPr>
+        <w:t>Typical Java Performance Issues</w:t>
+      </w:r>
+    </w:p>
+    <w:p>
+      <w:r>
+        <w:t>Java apps are known to suffer from a few common hiccups all too familiar to any Java dev. These include memory leaks, excessive garbage collection, and inefficient API usage, each capable of dragging down the system's performance.</w:t>
+      </w:r>
+    </w:p>
+    <w:p>
+      <w:r>
+        <w:rPr>
+          <w:b/>
+          <w:bCs/>
+        </w:rPr>
+        <w:t>Memory Leaks</w:t>
+      </w:r>
+      <w:r>
+        <w:t>: Even small leaks can escalate over time, eventually consuming significant system resources and degrading performance. This is particularly critical in environments where applications need to operate non-stop.</w:t>
+      </w:r>
+    </w:p>
+    <w:p>
+      <w:r>
+        <w:rPr>
+          <w:b/>
+          <w:bCs/>
+        </w:rPr>
+        <w:t>Excessive Garbage Collection</w:t>
+      </w:r>
+      <w:r>
+        <w:t>: Java's automatic memory management much too often becomes a bottleneck. Under heavy load, your system will pause other processes during garbage collection, which can lead to noticeable delays – unacceptable in fintech environments.</w:t>
+      </w:r>
+    </w:p>
+    <w:p>
+      <w:r>
+        <w:rPr>
+          <w:b/>
+          <w:bCs/>
+        </w:rPr>
+        <w:t>Inefficient API Usage</w:t>
+      </w:r>
+      <w:r>
+        <w:t>: Using Java APIs inefficiently can slow things down considerably. For example, an improper application of the Streams API can lead to performance that is worse than using simple loops, especially for large data sets.</w:t>
+      </w:r>
+    </w:p>
+    <w:p>
+      <w:r>
+        <w:t xml:space="preserve">Addressing these issues effectively requires a clear understanding of where the bottlenecks are happening. Profiling tools like Visual VM bundled with the JDK or highly popular commercial option, </w:t>
+      </w:r>
+      <w:proofErr w:type="spellStart"/>
+      <w:r>
+        <w:t>JProfiler</w:t>
+      </w:r>
+      <w:proofErr w:type="spellEnd"/>
+      <w:r>
+        <w:t>, are indispensable here, helping you spot exactly where resources are being mismanaged. Benchmarking complements profiling by measuring the effects of changes to the system. It allows developers to evaluate the practical impact of their optimizations on application performance. My tools of choice here are JMH and Apache JMeter.</w:t>
+      </w:r>
+    </w:p>
+    <w:p>
+      <w:r>
+        <w:t>Below, we will explore specific strategies to address these performance bottlenecks, enhancing both the efficiency and scalability of your Java apps.</w:t>
+      </w:r>
+    </w:p>
+    <w:p>
+      <w:r>
+        <w:rPr>
+          <w:b/>
+          <w:bCs/>
+        </w:rPr>
+        <w:t>Key Strategies for Java Performance Tuning</w:t>
+      </w:r>
+    </w:p>
+    <w:p>
+      <w:r>
+        <w:t>Code Optimization</w:t>
+      </w:r>
+    </w:p>
+    <w:p>
+      <w:r>
+        <w:t>Optimising Java code is crucial in fintech applications where performance directly impacts efficiency and user satisfaction. Here are four advanced strategies that can significantly enhance your code:</w:t>
+      </w:r>
+    </w:p>
+    <w:p>
+      <w:r>
+        <w:rPr>
+          <w:b/>
+          <w:bCs/>
+        </w:rPr>
+        <w:t>Advanced Collection Usage:</w:t>
+      </w:r>
+      <w:r>
+        <w:t xml:space="preserve"> Leverage </w:t>
+      </w:r>
+      <w:proofErr w:type="spellStart"/>
+      <w:r>
+        <w:t>LinkedHashMap</w:t>
+      </w:r>
+      <w:proofErr w:type="spellEnd"/>
+      <w:r>
+        <w:t xml:space="preserve"> for its order-preserving properties and </w:t>
+      </w:r>
+      <w:proofErr w:type="spellStart"/>
+      <w:r>
+        <w:t>TreeMap</w:t>
+      </w:r>
+      <w:proofErr w:type="spellEnd"/>
+      <w:r>
+        <w:t xml:space="preserve"> for sorted data operations. Employ </w:t>
+      </w:r>
+      <w:proofErr w:type="spellStart"/>
+      <w:r>
+        <w:t>EnumSet</w:t>
+      </w:r>
+      <w:proofErr w:type="spellEnd"/>
+      <w:r>
+        <w:t xml:space="preserve"> when handling </w:t>
+      </w:r>
+      <w:proofErr w:type="spellStart"/>
+      <w:r>
+        <w:t>enums</w:t>
+      </w:r>
+      <w:proofErr w:type="spellEnd"/>
+      <w:r>
+        <w:t xml:space="preserve"> to achieve faster searches and more efficient set operations to significantly improve performance over more generic set implementations.</w:t>
+      </w:r>
+    </w:p>
+    <w:p>
+      <w:r>
+        <w:rPr>
+          <w:b/>
+          <w:bCs/>
+        </w:rPr>
+        <w:t>Smart Use of Streams:</w:t>
+      </w:r>
+      <w:r>
+        <w:t xml:space="preserve"> Use specialised stream types like </w:t>
+      </w:r>
+      <w:proofErr w:type="spellStart"/>
+      <w:r>
+        <w:t>IntStream</w:t>
+      </w:r>
+      <w:proofErr w:type="spellEnd"/>
+      <w:r>
+        <w:t xml:space="preserve"> or </w:t>
+      </w:r>
+      <w:proofErr w:type="spellStart"/>
+      <w:r>
+        <w:t>LongStream</w:t>
+      </w:r>
+      <w:proofErr w:type="spellEnd"/>
+      <w:r>
+        <w:t xml:space="preserve"> to handle primitive types directly and avoid unnecessary boxing. For parallel streams, tailor your </w:t>
+      </w:r>
+      <w:proofErr w:type="spellStart"/>
+      <w:r>
+        <w:t>Spliterator</w:t>
+      </w:r>
+      <w:proofErr w:type="spellEnd"/>
+      <w:r>
+        <w:t xml:space="preserve"> to enhance the division of tasks, which can markedly improve performance in data-intensive operations.</w:t>
+      </w:r>
+    </w:p>
+    <w:p>
+      <w:proofErr w:type="spellStart"/>
+      <w:r>
+        <w:rPr>
+          <w:b/>
+          <w:bCs/>
+        </w:rPr>
+        <w:t>Memoization</w:t>
+      </w:r>
+      <w:proofErr w:type="spellEnd"/>
+      <w:r>
+        <w:rPr>
+          <w:b/>
+          <w:bCs/>
+        </w:rPr>
+        <w:t xml:space="preserve"> Techniques:</w:t>
+      </w:r>
+      <w:r>
+        <w:t xml:space="preserve"> Apply </w:t>
+      </w:r>
+      <w:proofErr w:type="spellStart"/>
+      <w:r>
+        <w:t>memoization</w:t>
+      </w:r>
+      <w:proofErr w:type="spellEnd"/>
+      <w:r>
+        <w:t xml:space="preserve"> to cache results of expensive computations, ensuring that functions like complex financial calculations are only computed once. Libraries like Guava offer built-in support for </w:t>
+      </w:r>
+      <w:proofErr w:type="spellStart"/>
+      <w:r>
+        <w:t>memoization</w:t>
+      </w:r>
+      <w:proofErr w:type="spellEnd"/>
+      <w:r>
+        <w:t>, which can be seamlessly integrated into your app.</w:t>
+      </w:r>
+    </w:p>
+    <w:p>
+      <w:r>
+        <w:rPr>
+          <w:b/>
+          <w:bCs/>
+        </w:rPr>
+        <w:t>Concurrency Enhancements:</w:t>
+      </w:r>
+      <w:r>
+        <w:t xml:space="preserve"> Employ non-blocking data structures such as </w:t>
+      </w:r>
+      <w:proofErr w:type="spellStart"/>
+      <w:r>
+        <w:t>ConcurrentHashMap</w:t>
+      </w:r>
+      <w:proofErr w:type="spellEnd"/>
+      <w:r>
+        <w:t xml:space="preserve"> and use </w:t>
+      </w:r>
+      <w:proofErr w:type="spellStart"/>
+      <w:r>
+        <w:t>LongAdder</w:t>
+      </w:r>
+      <w:proofErr w:type="spellEnd"/>
+      <w:r>
+        <w:t xml:space="preserve"> for efficient concurrent counting and summing. These tools are designed for high-performance environments and can drastically reduce the overhead associated with thread contention.</w:t>
+      </w:r>
+    </w:p>
+    <w:p>
+      <w:r>
+        <w:t>When implementing these code optimization strategies, remember to profile and benchmark your app both before and after making these changes. This way, you ensure that the changes provide real performance enhancements without introducing new issues.</w:t>
+      </w:r>
+    </w:p>
+    <w:p>
+      <w:r>
+        <w:rPr>
+          <w:b/>
+          <w:bCs/>
+        </w:rPr>
+        <w:t>Concurrency Management</w:t>
+      </w:r>
+    </w:p>
+    <w:p>
+      <w:r>
+        <w:t>Efficient concurrency management is critical in fintech, where applications must handle numerous simultaneous transactions without compromising on speed or accuracy. Here are some sophisticated techniques and tools for optimising concurrency in Java:</w:t>
+      </w:r>
+    </w:p>
+    <w:p>
+      <w:proofErr w:type="spellStart"/>
+      <w:r>
+        <w:rPr>
+          <w:b/>
+          <w:bCs/>
+        </w:rPr>
+        <w:t>ExecutorService</w:t>
+      </w:r>
+      <w:proofErr w:type="spellEnd"/>
+      <w:r>
+        <w:rPr>
+          <w:b/>
+          <w:bCs/>
+        </w:rPr>
+        <w:t xml:space="preserve"> Customization:</w:t>
+      </w:r>
+      <w:r>
+        <w:t xml:space="preserve"> Tailor your use of </w:t>
+      </w:r>
+      <w:proofErr w:type="spellStart"/>
+      <w:r>
+        <w:t>ExecutorService</w:t>
+      </w:r>
+      <w:proofErr w:type="spellEnd"/>
+      <w:r>
+        <w:t xml:space="preserve"> to fit the specific needs of your app. For example, consider using a </w:t>
+      </w:r>
+      <w:proofErr w:type="spellStart"/>
+      <w:r>
+        <w:t>ThreadPoolExecutor</w:t>
+      </w:r>
+      <w:proofErr w:type="spellEnd"/>
+      <w:r>
+        <w:t xml:space="preserve"> with a dynamic number of threads or tune the parameters of the thread pool based on the workload characteristics observed from performance monitoring.</w:t>
+      </w:r>
+    </w:p>
+    <w:p>
+      <w:r>
+        <w:rPr>
+          <w:b/>
+          <w:bCs/>
+        </w:rPr>
+        <w:t>Advanced Locking Mechanisms:</w:t>
+      </w:r>
+      <w:r>
+        <w:t xml:space="preserve"> Move beyond simple synchronised blocks by implementing finer-grained locks. Utilise </w:t>
+      </w:r>
+      <w:proofErr w:type="spellStart"/>
+      <w:r>
+        <w:t>ReentrantLock</w:t>
+      </w:r>
+      <w:proofErr w:type="spellEnd"/>
+      <w:r>
+        <w:t xml:space="preserve"> for its advanced features like timed lock attempts, lock polling, or fair queuing. This can provide more control over thread behaviour and reduce the risk of deadlock in complex transaction systems.</w:t>
+      </w:r>
+    </w:p>
+    <w:p>
+      <w:r>
+        <w:rPr>
+          <w:b/>
+          <w:bCs/>
+        </w:rPr>
+        <w:t>Optimise Resource Sharing:</w:t>
+      </w:r>
+      <w:r>
+        <w:t xml:space="preserve"> Use Semaphore or </w:t>
+      </w:r>
+      <w:proofErr w:type="spellStart"/>
+      <w:r>
+        <w:t>CountDownLatch</w:t>
+      </w:r>
+      <w:proofErr w:type="spellEnd"/>
+      <w:r>
+        <w:t xml:space="preserve"> to manage complex inter-thread dependencies, especially where certain operations must wait for others to complete. These can be crucial in scenarios where you need to throttle the amount of concurrent access to a resource (like a database or an API).</w:t>
+      </w:r>
+    </w:p>
+    <w:p>
+      <w:r>
+        <w:rPr>
+          <w:b/>
+          <w:bCs/>
+        </w:rPr>
+        <w:t>Leverage Non-Blocking Algorithms:</w:t>
+      </w:r>
+      <w:r>
+        <w:t> Implement non-blocking algorithms where possible, using atomic variables (</w:t>
+      </w:r>
+      <w:proofErr w:type="spellStart"/>
+      <w:r>
+        <w:t>AtomicInteger</w:t>
+      </w:r>
+      <w:proofErr w:type="spellEnd"/>
+      <w:r>
+        <w:t xml:space="preserve">, </w:t>
+      </w:r>
+      <w:proofErr w:type="spellStart"/>
+      <w:r>
+        <w:t>AtomicReference</w:t>
+      </w:r>
+      <w:proofErr w:type="spellEnd"/>
+      <w:r>
+        <w:t>) and concurrent data structures (</w:t>
+      </w:r>
+      <w:proofErr w:type="spellStart"/>
+      <w:r>
+        <w:t>ConcurrentLinkedQueue</w:t>
+      </w:r>
+      <w:proofErr w:type="spellEnd"/>
+      <w:r>
+        <w:t>). These structures help avoid locking and can significantly improve performance in high-concurrency environments. Incorporate optimistic locking techniques, which rely on atomic check-commit operations like compare-and-swap, to handle concurrent modifications more efficiently. By anticipating minimal conflict and only rolling back if a conflict occurs, optimistic locking reduces overhead associated with traditional lock-based synchronisation, further enhancing performance.</w:t>
+      </w:r>
+    </w:p>
+    <w:p>
+      <w:r>
+        <w:rPr>
+          <w:b/>
+          <w:bCs/>
+        </w:rPr>
+        <w:t>Garbage Collection Tuning</w:t>
+      </w:r>
+    </w:p>
+    <w:p>
+      <w:r>
+        <w:t>Optimising garbage collection in Java is crucial for fintech applications where performance and low latency are key. Here’s a straightforward approach to fine-tuning your garbage collection:</w:t>
+      </w:r>
+    </w:p>
+    <w:p>
+      <w:r>
+        <w:t>Select the Right Garbage Collector: The choice of garbage collector affects your app’s performance. For environments where predictable pause times are crucial, the Garbage-First (G1) collector is often a good fit. It organises the heap into multiple regions to manage memory more effectively, aiming to optimise GC pauses.</w:t>
+      </w:r>
+    </w:p>
+    <w:p>
+      <w:r>
+        <w:t>Adjust GC Settings: Modifying JVM settings can make a noticeable difference. Setting the initial and maximum heap sizes with -</w:t>
+      </w:r>
+      <w:proofErr w:type="spellStart"/>
+      <w:r>
+        <w:t>Xms</w:t>
+      </w:r>
+      <w:proofErr w:type="spellEnd"/>
+      <w:r>
+        <w:t xml:space="preserve"> and -</w:t>
+      </w:r>
+      <w:proofErr w:type="spellStart"/>
+      <w:proofErr w:type="gramStart"/>
+      <w:r>
+        <w:t>Xmx</w:t>
+      </w:r>
+      <w:proofErr w:type="spellEnd"/>
+      <w:r>
+        <w:t>, or</w:t>
+      </w:r>
+      <w:proofErr w:type="gramEnd"/>
+      <w:r>
+        <w:t xml:space="preserve"> adjusting the young to old generation ratio with -</w:t>
+      </w:r>
+      <w:proofErr w:type="spellStart"/>
+      <w:proofErr w:type="gramStart"/>
+      <w:r>
+        <w:t>XX:NewRatio</w:t>
+      </w:r>
+      <w:proofErr w:type="spellEnd"/>
+      <w:proofErr w:type="gramEnd"/>
+      <w:r>
+        <w:t>, are practical starts. These adjustments can help control the frequency and duration of garbage collections.</w:t>
+      </w:r>
+    </w:p>
+    <w:p>
+      <w:r>
+        <w:t xml:space="preserve">Monitor and Adapt: Use tools like </w:t>
+      </w:r>
+      <w:proofErr w:type="spellStart"/>
+      <w:r>
+        <w:t>VisualVM</w:t>
+      </w:r>
+      <w:proofErr w:type="spellEnd"/>
+      <w:r>
+        <w:t xml:space="preserve"> or Java Mission Control to keep an eye on your app's garbage collection metrics. These tools provide live data on heap usage and GC pauses, which is essential for timely adjustments.</w:t>
+      </w:r>
+    </w:p>
+    <w:p>
+      <w:r>
+        <w:rPr>
+          <w:b/>
+          <w:bCs/>
+        </w:rPr>
+        <w:t>Scalability Techniques for Java in Fintech</w:t>
+      </w:r>
+    </w:p>
+    <w:p>
+      <w:r>
+        <w:rPr>
+          <w:b/>
+          <w:bCs/>
+        </w:rPr>
+        <w:t>Horizontal vs. Vertical Scaling</w:t>
+      </w:r>
+    </w:p>
+    <w:p>
+      <w:r>
+        <w:t xml:space="preserve">Scaling Java apps in fintech requires a strategic choice between horizontal and vertical scaling, each suited to different scenarios. Horizontal scaling adds more machines to handle increased load, </w:t>
+      </w:r>
+      <w:proofErr w:type="gramStart"/>
+      <w:r>
+        <w:t>similar to</w:t>
+      </w:r>
+      <w:proofErr w:type="gramEnd"/>
+      <w:r>
+        <w:t xml:space="preserve"> adding lanes to a highway. It's ideal for applications that can run in parallel, effectively managing growing user demands. Vertical scaling, however, involves boosting the existing machines' power with more CPU or RAM, akin to upgrading to faster lanes. While simpler for short-term needs, its scalability is limited by hardware constraints.</w:t>
+      </w:r>
+    </w:p>
+    <w:p>
+      <w:r>
+        <w:t>Choosing the right scaling method depends on your app’s design and operational demands. Horizontal scaling offers long-term flexibility, whereas vertical scaling can be a quick fix but may become costly as demands increase. In fintech, where load spikes are common, employing both strategies might be necessary to ensure robust performance.</w:t>
+      </w:r>
+    </w:p>
+    <w:p>
+      <w:r>
+        <w:rPr>
+          <w:b/>
+          <w:bCs/>
+        </w:rPr>
+        <w:t>Load Balancing</w:t>
+      </w:r>
+    </w:p>
+    <w:p>
+      <w:r>
+        <w:t>In fintech, where transactions occur by the millisecond, effective load balancing is key to maintaining system performance and reliability. It's about distributing incoming network traffic across multiple servers to ensure no single server bears too much burden.</w:t>
+      </w:r>
+    </w:p>
+    <w:p>
+      <w:r>
+        <w:t>For a more hands-on approach, consider tools like Nginx or Apache HTTP Server. These tools can manage traffic through methods like round-robin, where requests are evenly distributed, or by more dynamic criteria such as current server load or response times. For example, Nginx can be configured to monitor server health and reroute traffic away from servers under heavy load, enhancing responsiveness and uptime.</w:t>
+      </w:r>
+    </w:p>
+    <w:p>
+      <w:r>
+        <w:t>Additionally, hardware-based solutions like F5 Big-IP can offer deeper control with features like global server load balancing, which directs users to the closest or best-performing data centre. This kind of strategy is crucial in fintech, where milliseconds in response times can be the difference between profit and loss.</w:t>
+      </w:r>
+    </w:p>
+    <w:p>
+      <w:r>
+        <w:t>Implementing load balancing is not just about handling the current volume of transactions but also preparing for future spikes in demand. This foresight ensures that as your application scales, performance remains consistent, helping to avoid potential bottlenecks that could affect transaction processing or user experience.</w:t>
+      </w:r>
+    </w:p>
+    <w:p>
+      <w:r>
+        <w:rPr>
+          <w:b/>
+          <w:bCs/>
+        </w:rPr>
+        <w:t>Microservices Architecture</w:t>
+      </w:r>
+    </w:p>
+    <w:p>
+      <w:r>
+        <w:t>Switching to a microservices architecture can transform scalability and agility in fintech apps. Instead of a single, bulky application, microservices split functionality into smaller, standalone services that operate independently. This structure is particularly beneficial in fintech, where different aspects of the system – may have varying demand levels and scalability needs.</w:t>
+      </w:r>
+    </w:p>
+    <w:p>
+      <w:r>
+        <w:t>Tools like Docker and Kubernetes are pivotal in managing these microservices by containerizing them, which simplifies deployment and enhances operational scalability across varied environments. However, microservices introduce complexities like ensuring data consistency and managing service-to-service communications. Implementing an API gateway streamlines these interactions, while an event-driven architecture ensures that services can respond promptly and effectively to real-time changes.</w:t>
+      </w:r>
+    </w:p>
+    <w:p>
+      <w:r>
+        <w:t>In fintech, where the ability to quickly adapt to market changes is vital, microservices provide a flexible architecture that supports fast-paced development and efficient resource utilisation, making it an essential strategy for dynamic and growth-oriented financial platforms.</w:t>
+      </w:r>
+    </w:p>
+    <w:p>
+      <w:r>
+        <w:rPr>
+          <w:b/>
+          <w:bCs/>
+        </w:rPr>
+        <w:t>Conclusion</w:t>
+      </w:r>
+    </w:p>
+    <w:p>
+      <w:r>
+        <w:t>Optimising Java apps for performance and scalability is critical in the fintech sector. By applying targeted strategies such as efficient garbage collection, advanced code optimization, effective concurrency management, and a robust microservices architecture, you ensure your systems are both agile and capable of scaling. Each element plays a vital role in enhancing application performance.</w:t>
+      </w:r>
+    </w:p>
+    <w:p>
+      <w:r>
+        <w:t>Do your Java apps meet the demanding requirements of modern fintech environments? Regular profiling and benchmarking are essential to answer this question accurately. They help you gauge the impact of your optimizations and make necessary adjustments. As you continue to refine these strategies, your apps will not only satisfy current operational demands but will also be prepared to handle future challenges. In fintech, staying ahead means keeping your systems optimised, responsive, and ready to scale at a moment's notice.</w:t>
       </w:r>
     </w:p>
     <w:p/>
@@ -11178,6 +11924,29 @@
       <w:szCs w:val="24"/>
     </w:rPr>
   </w:style>
+  <w:style w:type="character" w:styleId="Hyperlink">
+    <w:name w:val="Hyperlink"/>
+    <w:basedOn w:val="DefaultParagraphFont"/>
+    <w:uiPriority w:val="99"/>
+    <w:unhideWhenUsed/>
+    <w:rsid w:val="00441B96"/>
+    <w:rPr>
+      <w:color w:val="0563C1" w:themeColor="hyperlink"/>
+      <w:u w:val="single"/>
+    </w:rPr>
+  </w:style>
+  <w:style w:type="character" w:styleId="UnresolvedMention">
+    <w:name w:val="Unresolved Mention"/>
+    <w:basedOn w:val="DefaultParagraphFont"/>
+    <w:uiPriority w:val="99"/>
+    <w:semiHidden/>
+    <w:unhideWhenUsed/>
+    <w:rsid w:val="00441B96"/>
+    <w:rPr>
+      <w:color w:val="605E5C"/>
+      <w:shd w:val="clear" w:color="auto" w:fill="E1DFDD"/>
+    </w:rPr>
+  </w:style>
 </w:styles>
 </file>
 

</xml_diff>